<commit_message>
CA: assigned user story tasks for all team member that need to still make acceptance tests.
</commit_message>
<xml_diff>
--- a/BlastImplementation/documentation/Use case diagram/useCase_userStories/UserStories_21042026_final.docx
+++ b/BlastImplementation/documentation/Use case diagram/useCase_userStories/UserStories_21042026_final.docx
@@ -387,6 +387,51 @@
       </w:r>
       <w:r>
         <w:t xml:space="preserve"> in the text box or to upload a query FASTA file.</w:t>
+      </w:r>
+    </w:p>
+    <w:p/>
+    <w:p>
+      <w:r>
+        <w:rPr>
+          <w:highlight w:val="green"/>
+        </w:rPr>
+        <w:t>Swayam</w:t>
+      </w:r>
+      <w:r>
+        <w:t xml:space="preserve">, </w:t>
+      </w:r>
+      <w:r>
+        <w:rPr>
+          <w:highlight w:val="cyan"/>
+        </w:rPr>
+        <w:t>Loran</w:t>
+      </w:r>
+      <w:r>
+        <w:t xml:space="preserve">, </w:t>
+      </w:r>
+      <w:r>
+        <w:rPr>
+          <w:highlight w:val="magenta"/>
+        </w:rPr>
+        <w:t>Shreyas</w:t>
+      </w:r>
+      <w:r>
+        <w:t xml:space="preserve">, </w:t>
+      </w:r>
+      <w:r>
+        <w:rPr>
+          <w:highlight w:val="lightGray"/>
+        </w:rPr>
+        <w:t>Wouter</w:t>
+      </w:r>
+      <w:r>
+        <w:t xml:space="preserve">, </w:t>
+      </w:r>
+      <w:r>
+        <w:rPr>
+          <w:highlight w:val="darkGreen"/>
+        </w:rPr>
+        <w:t>Milan</w:t>
       </w:r>
     </w:p>
     <w:p/>
@@ -1300,12 +1345,12 @@
       <w:pPr>
         <w:pStyle w:val="Heading3"/>
         <w:rPr>
-          <w:highlight w:val="yellow"/>
-        </w:rPr>
-      </w:pPr>
-      <w:r>
-        <w:rPr>
-          <w:highlight w:val="yellow"/>
+          <w:highlight w:val="green"/>
+        </w:rPr>
+      </w:pPr>
+      <w:r>
+        <w:rPr>
+          <w:highlight w:val="green"/>
         </w:rPr>
         <w:t>Parsing custom output file to match UNIPROT output file</w:t>
       </w:r>
@@ -1327,20 +1372,20 @@
           <w:p>
             <w:pPr>
               <w:rPr>
-                <w:highlight w:val="yellow"/>
-              </w:rPr>
-            </w:pPr>
-            <w:r>
-              <w:rPr>
-                <w:b/>
-                <w:bCs/>
-                <w:highlight w:val="yellow"/>
+                <w:highlight w:val="green"/>
+              </w:rPr>
+            </w:pPr>
+            <w:r>
+              <w:rPr>
+                <w:b/>
+                <w:bCs/>
+                <w:highlight w:val="green"/>
               </w:rPr>
               <w:t>As</w:t>
             </w:r>
             <w:r>
               <w:rPr>
-                <w:highlight w:val="yellow"/>
+                <w:highlight w:val="green"/>
               </w:rPr>
               <w:t xml:space="preserve"> a life science scientist</w:t>
             </w:r>
@@ -1355,26 +1400,26 @@
           <w:p>
             <w:pPr>
               <w:rPr>
-                <w:highlight w:val="yellow"/>
-              </w:rPr>
-            </w:pPr>
-            <w:r>
-              <w:rPr>
-                <w:b/>
-                <w:bCs/>
-                <w:highlight w:val="yellow"/>
+                <w:highlight w:val="green"/>
+              </w:rPr>
+            </w:pPr>
+            <w:r>
+              <w:rPr>
+                <w:b/>
+                <w:bCs/>
+                <w:highlight w:val="green"/>
               </w:rPr>
               <w:t>I want</w:t>
             </w:r>
             <w:r>
               <w:rPr>
-                <w:highlight w:val="yellow"/>
+                <w:highlight w:val="green"/>
               </w:rPr>
               <w:t xml:space="preserve"> </w:t>
             </w:r>
             <w:r>
               <w:rPr>
-                <w:highlight w:val="yellow"/>
+                <w:highlight w:val="green"/>
               </w:rPr>
               <w:t>to see that my outputs are consistent</w:t>
             </w:r>
@@ -1389,26 +1434,26 @@
           <w:p>
             <w:pPr>
               <w:rPr>
-                <w:highlight w:val="yellow"/>
-              </w:rPr>
-            </w:pPr>
-            <w:r>
-              <w:rPr>
-                <w:b/>
-                <w:bCs/>
-                <w:highlight w:val="yellow"/>
+                <w:highlight w:val="green"/>
+              </w:rPr>
+            </w:pPr>
+            <w:r>
+              <w:rPr>
+                <w:b/>
+                <w:bCs/>
+                <w:highlight w:val="green"/>
               </w:rPr>
               <w:t>So that</w:t>
             </w:r>
             <w:r>
               <w:rPr>
-                <w:highlight w:val="yellow"/>
+                <w:highlight w:val="green"/>
               </w:rPr>
               <w:t xml:space="preserve"> </w:t>
             </w:r>
             <w:r>
               <w:rPr>
-                <w:highlight w:val="yellow"/>
+                <w:highlight w:val="green"/>
               </w:rPr>
               <w:t>I can analyze the data with less errors</w:t>
             </w:r>
@@ -1423,20 +1468,20 @@
           <w:p>
             <w:pPr>
               <w:rPr>
-                <w:highlight w:val="yellow"/>
-              </w:rPr>
-            </w:pPr>
-            <w:r>
-              <w:rPr>
-                <w:b/>
-                <w:bCs/>
-                <w:highlight w:val="yellow"/>
+                <w:highlight w:val="green"/>
+              </w:rPr>
+            </w:pPr>
+            <w:r>
+              <w:rPr>
+                <w:b/>
+                <w:bCs/>
+                <w:highlight w:val="green"/>
               </w:rPr>
               <w:t>Acceptance criteria</w:t>
             </w:r>
             <w:r>
               <w:rPr>
-                <w:highlight w:val="yellow"/>
+                <w:highlight w:val="green"/>
               </w:rPr>
               <w:t>:</w:t>
             </w:r>
@@ -1444,44 +1489,44 @@
           <w:p>
             <w:pPr>
               <w:rPr>
-                <w:highlight w:val="yellow"/>
-              </w:rPr>
-            </w:pPr>
-            <w:r>
-              <w:rPr>
-                <w:highlight w:val="yellow"/>
+                <w:highlight w:val="green"/>
+              </w:rPr>
+            </w:pPr>
+            <w:r>
+              <w:rPr>
+                <w:highlight w:val="green"/>
               </w:rPr>
               <w:t xml:space="preserve">Having two </w:t>
             </w:r>
             <w:proofErr w:type="spellStart"/>
             <w:r>
               <w:rPr>
-                <w:highlight w:val="yellow"/>
+                <w:highlight w:val="green"/>
               </w:rPr>
               <w:t>tsv</w:t>
             </w:r>
             <w:proofErr w:type="spellEnd"/>
             <w:r>
               <w:rPr>
-                <w:highlight w:val="yellow"/>
+                <w:highlight w:val="green"/>
               </w:rPr>
               <w:t xml:space="preserve"> </w:t>
             </w:r>
             <w:r>
               <w:rPr>
-                <w:highlight w:val="yellow"/>
+                <w:highlight w:val="green"/>
               </w:rPr>
               <w:t xml:space="preserve">files </w:t>
             </w:r>
             <w:r>
               <w:rPr>
-                <w:highlight w:val="yellow"/>
+                <w:highlight w:val="green"/>
               </w:rPr>
               <w:t xml:space="preserve">which show the </w:t>
             </w:r>
             <w:r>
               <w:rPr>
-                <w:highlight w:val="yellow"/>
+                <w:highlight w:val="green"/>
               </w:rPr>
               <w:t xml:space="preserve">same header </w:t>
             </w:r>
@@ -1498,14 +1543,14 @@
               <w:rPr>
                 <w:b/>
                 <w:bCs/>
-                <w:highlight w:val="yellow"/>
-              </w:rPr>
-            </w:pPr>
-            <w:r>
-              <w:rPr>
-                <w:b/>
-                <w:bCs/>
-                <w:highlight w:val="yellow"/>
+                <w:highlight w:val="green"/>
+              </w:rPr>
+            </w:pPr>
+            <w:r>
+              <w:rPr>
+                <w:b/>
+                <w:bCs/>
+                <w:highlight w:val="green"/>
               </w:rPr>
               <w:t>Acceptance test:</w:t>
             </w:r>
@@ -1513,18 +1558,18 @@
           <w:p>
             <w:pPr>
               <w:rPr>
-                <w:highlight w:val="yellow"/>
-              </w:rPr>
-            </w:pPr>
-            <w:r>
-              <w:rPr>
-                <w:highlight w:val="yellow"/>
+                <w:highlight w:val="green"/>
+              </w:rPr>
+            </w:pPr>
+            <w:r>
+              <w:rPr>
+                <w:highlight w:val="green"/>
               </w:rPr>
               <w:t xml:space="preserve">In BLAST output GUI, </w:t>
             </w:r>
             <w:r>
               <w:rPr>
-                <w:highlight w:val="yellow"/>
+                <w:highlight w:val="green"/>
               </w:rPr>
               <w:t xml:space="preserve">custom file result should be the same as UNIPROT file </w:t>
             </w:r>
@@ -1536,12 +1581,12 @@
       <w:pPr>
         <w:pStyle w:val="Heading3"/>
         <w:rPr>
-          <w:highlight w:val="yellow"/>
-        </w:rPr>
-      </w:pPr>
-      <w:r>
-        <w:rPr>
-          <w:highlight w:val="yellow"/>
+          <w:highlight w:val="green"/>
+        </w:rPr>
+      </w:pPr>
+      <w:r>
+        <w:rPr>
+          <w:highlight w:val="green"/>
         </w:rPr>
         <w:t>View statistics for both DNA and Protein</w:t>
       </w:r>
@@ -1563,20 +1608,20 @@
           <w:p>
             <w:pPr>
               <w:rPr>
-                <w:highlight w:val="yellow"/>
-              </w:rPr>
-            </w:pPr>
-            <w:r>
-              <w:rPr>
-                <w:b/>
-                <w:bCs/>
-                <w:highlight w:val="yellow"/>
+                <w:highlight w:val="green"/>
+              </w:rPr>
+            </w:pPr>
+            <w:r>
+              <w:rPr>
+                <w:b/>
+                <w:bCs/>
+                <w:highlight w:val="green"/>
               </w:rPr>
               <w:t xml:space="preserve">As a </w:t>
             </w:r>
             <w:r>
               <w:rPr>
-                <w:highlight w:val="yellow"/>
+                <w:highlight w:val="green"/>
               </w:rPr>
               <w:t>life science scientist</w:t>
             </w:r>
@@ -1591,26 +1636,26 @@
           <w:p>
             <w:pPr>
               <w:rPr>
-                <w:highlight w:val="yellow"/>
-              </w:rPr>
-            </w:pPr>
-            <w:r>
-              <w:rPr>
-                <w:b/>
-                <w:bCs/>
-                <w:highlight w:val="yellow"/>
+                <w:highlight w:val="green"/>
+              </w:rPr>
+            </w:pPr>
+            <w:r>
+              <w:rPr>
+                <w:b/>
+                <w:bCs/>
+                <w:highlight w:val="green"/>
               </w:rPr>
               <w:t>I want</w:t>
             </w:r>
             <w:r>
               <w:rPr>
-                <w:highlight w:val="yellow"/>
+                <w:highlight w:val="green"/>
               </w:rPr>
               <w:t xml:space="preserve"> </w:t>
             </w:r>
             <w:r>
               <w:rPr>
-                <w:highlight w:val="yellow"/>
+                <w:highlight w:val="green"/>
               </w:rPr>
               <w:t>to be able to see statistics based on the type of input (DNA/Protein)</w:t>
             </w:r>
@@ -1625,32 +1670,32 @@
           <w:p>
             <w:pPr>
               <w:rPr>
-                <w:highlight w:val="yellow"/>
-              </w:rPr>
-            </w:pPr>
-            <w:r>
-              <w:rPr>
-                <w:b/>
-                <w:bCs/>
-                <w:highlight w:val="yellow"/>
+                <w:highlight w:val="green"/>
+              </w:rPr>
+            </w:pPr>
+            <w:r>
+              <w:rPr>
+                <w:b/>
+                <w:bCs/>
+                <w:highlight w:val="green"/>
               </w:rPr>
               <w:t>So that</w:t>
             </w:r>
             <w:r>
               <w:rPr>
-                <w:highlight w:val="yellow"/>
+                <w:highlight w:val="green"/>
               </w:rPr>
               <w:t xml:space="preserve"> I</w:t>
             </w:r>
             <w:r>
               <w:rPr>
-                <w:highlight w:val="yellow"/>
+                <w:highlight w:val="green"/>
               </w:rPr>
               <w:t xml:space="preserve"> </w:t>
             </w:r>
             <w:r>
               <w:rPr>
-                <w:highlight w:val="yellow"/>
+                <w:highlight w:val="green"/>
               </w:rPr>
               <w:t>can run separate analysis on the types of input</w:t>
             </w:r>
@@ -1665,14 +1710,14 @@
           <w:p>
             <w:pPr>
               <w:rPr>
-                <w:highlight w:val="yellow"/>
-              </w:rPr>
-            </w:pPr>
-            <w:r>
-              <w:rPr>
-                <w:b/>
-                <w:bCs/>
-                <w:highlight w:val="yellow"/>
+                <w:highlight w:val="green"/>
+              </w:rPr>
+            </w:pPr>
+            <w:r>
+              <w:rPr>
+                <w:b/>
+                <w:bCs/>
+                <w:highlight w:val="green"/>
               </w:rPr>
               <w:t>Acceptance</w:t>
             </w:r>
@@ -1680,13 +1725,13 @@
               <w:rPr>
                 <w:b/>
                 <w:bCs/>
-                <w:highlight w:val="yellow"/>
+                <w:highlight w:val="green"/>
               </w:rPr>
               <w:t xml:space="preserve"> test</w:t>
             </w:r>
             <w:r>
               <w:rPr>
-                <w:highlight w:val="yellow"/>
+                <w:highlight w:val="green"/>
               </w:rPr>
               <w:t>:</w:t>
             </w:r>
@@ -1694,7 +1739,7 @@
           <w:p>
             <w:r>
               <w:rPr>
-                <w:highlight w:val="yellow"/>
+                <w:highlight w:val="green"/>
               </w:rPr>
               <w:t>Statistics.java and proteinStatistics.java should execute properly without any errors</w:t>
             </w:r>
@@ -1706,12 +1751,12 @@
       <w:pPr>
         <w:pStyle w:val="Heading3"/>
         <w:rPr>
-          <w:highlight w:val="yellow"/>
-        </w:rPr>
-      </w:pPr>
-      <w:r>
-        <w:rPr>
-          <w:highlight w:val="yellow"/>
+          <w:highlight w:val="cyan"/>
+        </w:rPr>
+      </w:pPr>
+      <w:r>
+        <w:rPr>
+          <w:highlight w:val="cyan"/>
         </w:rPr>
         <w:t xml:space="preserve">FASTA with multiple sequences is allowed by system </w:t>
       </w:r>
@@ -1733,20 +1778,20 @@
           <w:p>
             <w:pPr>
               <w:rPr>
-                <w:highlight w:val="yellow"/>
-              </w:rPr>
-            </w:pPr>
-            <w:r>
-              <w:rPr>
-                <w:b/>
-                <w:bCs/>
-                <w:highlight w:val="yellow"/>
+                <w:highlight w:val="cyan"/>
+              </w:rPr>
+            </w:pPr>
+            <w:r>
+              <w:rPr>
+                <w:b/>
+                <w:bCs/>
+                <w:highlight w:val="cyan"/>
               </w:rPr>
               <w:t>As a</w:t>
             </w:r>
             <w:r>
               <w:rPr>
-                <w:highlight w:val="yellow"/>
+                <w:highlight w:val="cyan"/>
               </w:rPr>
               <w:t xml:space="preserve"> life science scientist</w:t>
             </w:r>
@@ -1761,26 +1806,26 @@
           <w:p>
             <w:pPr>
               <w:rPr>
-                <w:highlight w:val="yellow"/>
-              </w:rPr>
-            </w:pPr>
-            <w:r>
-              <w:rPr>
-                <w:b/>
-                <w:bCs/>
-                <w:highlight w:val="yellow"/>
+                <w:highlight w:val="cyan"/>
+              </w:rPr>
+            </w:pPr>
+            <w:r>
+              <w:rPr>
+                <w:b/>
+                <w:bCs/>
+                <w:highlight w:val="cyan"/>
               </w:rPr>
               <w:t>I want</w:t>
             </w:r>
             <w:r>
               <w:rPr>
-                <w:highlight w:val="yellow"/>
+                <w:highlight w:val="cyan"/>
               </w:rPr>
               <w:t xml:space="preserve"> </w:t>
             </w:r>
             <w:r>
               <w:rPr>
-                <w:highlight w:val="yellow"/>
+                <w:highlight w:val="cyan"/>
               </w:rPr>
               <w:t>to be able to input multiple sequences into BLAST</w:t>
             </w:r>
@@ -1795,32 +1840,32 @@
           <w:p>
             <w:pPr>
               <w:rPr>
-                <w:highlight w:val="yellow"/>
-              </w:rPr>
-            </w:pPr>
-            <w:r>
-              <w:rPr>
-                <w:b/>
-                <w:bCs/>
-                <w:highlight w:val="yellow"/>
+                <w:highlight w:val="cyan"/>
+              </w:rPr>
+            </w:pPr>
+            <w:r>
+              <w:rPr>
+                <w:b/>
+                <w:bCs/>
+                <w:highlight w:val="cyan"/>
               </w:rPr>
               <w:t>So that</w:t>
             </w:r>
             <w:r>
               <w:rPr>
-                <w:highlight w:val="yellow"/>
+                <w:highlight w:val="cyan"/>
               </w:rPr>
               <w:t xml:space="preserve"> </w:t>
             </w:r>
             <w:r>
               <w:rPr>
-                <w:highlight w:val="yellow"/>
+                <w:highlight w:val="cyan"/>
               </w:rPr>
               <w:t xml:space="preserve">I can compare </w:t>
             </w:r>
             <w:r>
               <w:rPr>
-                <w:highlight w:val="yellow"/>
+                <w:highlight w:val="cyan"/>
               </w:rPr>
               <w:t>more sequences in one go to look at the relationship between sequences.</w:t>
             </w:r>
@@ -1837,14 +1882,14 @@
               <w:rPr>
                 <w:b/>
                 <w:bCs/>
-                <w:highlight w:val="yellow"/>
-              </w:rPr>
-            </w:pPr>
-            <w:r>
-              <w:rPr>
-                <w:b/>
-                <w:bCs/>
-                <w:highlight w:val="yellow"/>
+                <w:highlight w:val="cyan"/>
+              </w:rPr>
+            </w:pPr>
+            <w:r>
+              <w:rPr>
+                <w:b/>
+                <w:bCs/>
+                <w:highlight w:val="cyan"/>
               </w:rPr>
               <w:t>Acceptance</w:t>
             </w:r>
@@ -1852,7 +1897,7 @@
               <w:rPr>
                 <w:b/>
                 <w:bCs/>
-                <w:highlight w:val="yellow"/>
+                <w:highlight w:val="cyan"/>
               </w:rPr>
               <w:t xml:space="preserve"> test</w:t>
             </w:r>
@@ -1860,7 +1905,7 @@
               <w:rPr>
                 <w:b/>
                 <w:bCs/>
-                <w:highlight w:val="yellow"/>
+                <w:highlight w:val="cyan"/>
               </w:rPr>
               <w:t>:</w:t>
             </w:r>
@@ -1868,18 +1913,18 @@
           <w:p>
             <w:pPr>
               <w:rPr>
-                <w:highlight w:val="yellow"/>
-              </w:rPr>
-            </w:pPr>
-            <w:r>
-              <w:rPr>
-                <w:highlight w:val="yellow"/>
+                <w:highlight w:val="cyan"/>
+              </w:rPr>
+            </w:pPr>
+            <w:r>
+              <w:rPr>
+                <w:highlight w:val="cyan"/>
               </w:rPr>
               <w:t xml:space="preserve">System should accept multiple sequences and the output should show results </w:t>
             </w:r>
             <w:r>
               <w:rPr>
-                <w:highlight w:val="yellow"/>
+                <w:highlight w:val="cyan"/>
               </w:rPr>
               <w:t>for all the sequences</w:t>
             </w:r>
@@ -1891,12 +1936,12 @@
       <w:pPr>
         <w:pStyle w:val="Heading3"/>
         <w:rPr>
-          <w:highlight w:val="yellow"/>
-        </w:rPr>
-      </w:pPr>
-      <w:r>
-        <w:rPr>
-          <w:highlight w:val="yellow"/>
+          <w:highlight w:val="cyan"/>
+        </w:rPr>
+      </w:pPr>
+      <w:r>
+        <w:rPr>
+          <w:highlight w:val="cyan"/>
         </w:rPr>
         <w:t>Tool suggestion after statistics</w:t>
       </w:r>
@@ -1918,20 +1963,20 @@
           <w:p>
             <w:pPr>
               <w:rPr>
-                <w:highlight w:val="yellow"/>
-              </w:rPr>
-            </w:pPr>
-            <w:r>
-              <w:rPr>
-                <w:b/>
-                <w:bCs/>
-                <w:highlight w:val="yellow"/>
+                <w:highlight w:val="cyan"/>
+              </w:rPr>
+            </w:pPr>
+            <w:r>
+              <w:rPr>
+                <w:b/>
+                <w:bCs/>
+                <w:highlight w:val="cyan"/>
               </w:rPr>
               <w:t>As a</w:t>
             </w:r>
             <w:r>
               <w:rPr>
-                <w:highlight w:val="yellow"/>
+                <w:highlight w:val="cyan"/>
               </w:rPr>
               <w:t xml:space="preserve"> life science scientist</w:t>
             </w:r>
@@ -1946,20 +1991,20 @@
           <w:p>
             <w:pPr>
               <w:rPr>
-                <w:highlight w:val="yellow"/>
-              </w:rPr>
-            </w:pPr>
-            <w:r>
-              <w:rPr>
-                <w:b/>
-                <w:bCs/>
-                <w:highlight w:val="yellow"/>
+                <w:highlight w:val="cyan"/>
+              </w:rPr>
+            </w:pPr>
+            <w:r>
+              <w:rPr>
+                <w:b/>
+                <w:bCs/>
+                <w:highlight w:val="cyan"/>
               </w:rPr>
               <w:t>I want</w:t>
             </w:r>
             <w:r>
               <w:rPr>
-                <w:highlight w:val="yellow"/>
+                <w:highlight w:val="cyan"/>
               </w:rPr>
               <w:t xml:space="preserve"> to be able to be given recommendations on the type of tools to use based on the sequence I input </w:t>
             </w:r>
@@ -1974,26 +2019,26 @@
           <w:p>
             <w:pPr>
               <w:rPr>
-                <w:highlight w:val="yellow"/>
-              </w:rPr>
-            </w:pPr>
-            <w:r>
-              <w:rPr>
-                <w:b/>
-                <w:bCs/>
-                <w:highlight w:val="yellow"/>
+                <w:highlight w:val="cyan"/>
+              </w:rPr>
+            </w:pPr>
+            <w:r>
+              <w:rPr>
+                <w:b/>
+                <w:bCs/>
+                <w:highlight w:val="cyan"/>
               </w:rPr>
               <w:t>So that</w:t>
             </w:r>
             <w:r>
               <w:rPr>
-                <w:highlight w:val="yellow"/>
+                <w:highlight w:val="cyan"/>
               </w:rPr>
               <w:t xml:space="preserve"> </w:t>
             </w:r>
             <w:r>
               <w:rPr>
-                <w:highlight w:val="yellow"/>
+                <w:highlight w:val="cyan"/>
               </w:rPr>
               <w:t xml:space="preserve">I can make appropriate analysis depending on the type of input </w:t>
             </w:r>
@@ -2010,14 +2055,14 @@
               <w:rPr>
                 <w:b/>
                 <w:bCs/>
-                <w:highlight w:val="yellow"/>
-              </w:rPr>
-            </w:pPr>
-            <w:r>
-              <w:rPr>
-                <w:b/>
-                <w:bCs/>
-                <w:highlight w:val="yellow"/>
+                <w:highlight w:val="cyan"/>
+              </w:rPr>
+            </w:pPr>
+            <w:r>
+              <w:rPr>
+                <w:b/>
+                <w:bCs/>
+                <w:highlight w:val="cyan"/>
               </w:rPr>
               <w:t>Acceptance test:</w:t>
             </w:r>
@@ -2025,13 +2070,13 @@
           <w:p>
             <w:r>
               <w:rPr>
-                <w:highlight w:val="yellow"/>
+                <w:highlight w:val="cyan"/>
               </w:rPr>
               <w:t>Statistics output file should show other tools which can be used after getting information on</w:t>
             </w:r>
             <w:r>
               <w:rPr>
-                <w:highlight w:val="yellow"/>
+                <w:highlight w:val="cyan"/>
               </w:rPr>
               <w:t xml:space="preserve"> input sequence statistics.</w:t>
             </w:r>
@@ -2120,12 +2165,12 @@
       <w:pPr>
         <w:pStyle w:val="Heading3"/>
         <w:rPr>
-          <w:highlight w:val="yellow"/>
-        </w:rPr>
-      </w:pPr>
-      <w:r>
-        <w:rPr>
-          <w:highlight w:val="yellow"/>
+          <w:highlight w:val="magenta"/>
+        </w:rPr>
+      </w:pPr>
+      <w:r>
+        <w:rPr>
+          <w:highlight w:val="magenta"/>
         </w:rPr>
         <w:t>User friendly GUI for bioinformatics tools</w:t>
       </w:r>
@@ -2147,20 +2192,20 @@
           <w:p>
             <w:pPr>
               <w:rPr>
-                <w:highlight w:val="yellow"/>
-              </w:rPr>
-            </w:pPr>
-            <w:r>
-              <w:rPr>
-                <w:b/>
-                <w:bCs/>
-                <w:highlight w:val="yellow"/>
+                <w:highlight w:val="magenta"/>
+              </w:rPr>
+            </w:pPr>
+            <w:r>
+              <w:rPr>
+                <w:b/>
+                <w:bCs/>
+                <w:highlight w:val="magenta"/>
               </w:rPr>
               <w:t>As</w:t>
             </w:r>
             <w:r>
               <w:rPr>
-                <w:highlight w:val="yellow"/>
+                <w:highlight w:val="magenta"/>
               </w:rPr>
               <w:t xml:space="preserve"> a life science scientist</w:t>
             </w:r>
@@ -2175,26 +2220,26 @@
           <w:p>
             <w:pPr>
               <w:rPr>
-                <w:highlight w:val="yellow"/>
-              </w:rPr>
-            </w:pPr>
-            <w:r>
-              <w:rPr>
-                <w:b/>
-                <w:bCs/>
-                <w:highlight w:val="yellow"/>
+                <w:highlight w:val="magenta"/>
+              </w:rPr>
+            </w:pPr>
+            <w:r>
+              <w:rPr>
+                <w:b/>
+                <w:bCs/>
+                <w:highlight w:val="magenta"/>
               </w:rPr>
               <w:t>I want</w:t>
             </w:r>
             <w:r>
               <w:rPr>
-                <w:highlight w:val="yellow"/>
+                <w:highlight w:val="magenta"/>
               </w:rPr>
               <w:t xml:space="preserve"> </w:t>
             </w:r>
             <w:r>
               <w:rPr>
-                <w:highlight w:val="yellow"/>
+                <w:highlight w:val="magenta"/>
               </w:rPr>
               <w:t>a user friendly tool that I can use to run different bioinformatics tools</w:t>
             </w:r>
@@ -2209,26 +2254,26 @@
           <w:p>
             <w:pPr>
               <w:rPr>
-                <w:highlight w:val="yellow"/>
-              </w:rPr>
-            </w:pPr>
-            <w:r>
-              <w:rPr>
-                <w:b/>
-                <w:bCs/>
-                <w:highlight w:val="yellow"/>
+                <w:highlight w:val="magenta"/>
+              </w:rPr>
+            </w:pPr>
+            <w:r>
+              <w:rPr>
+                <w:b/>
+                <w:bCs/>
+                <w:highlight w:val="magenta"/>
               </w:rPr>
               <w:t>So that</w:t>
             </w:r>
             <w:r>
               <w:rPr>
-                <w:highlight w:val="yellow"/>
+                <w:highlight w:val="magenta"/>
               </w:rPr>
               <w:t xml:space="preserve"> </w:t>
             </w:r>
             <w:r>
               <w:rPr>
-                <w:highlight w:val="yellow"/>
+                <w:highlight w:val="magenta"/>
               </w:rPr>
               <w:t xml:space="preserve">I can conveniently use the bioinformatics tools without much specific bioinformatics knowledge. </w:t>
             </w:r>
@@ -2243,20 +2288,20 @@
           <w:p>
             <w:pPr>
               <w:rPr>
-                <w:highlight w:val="yellow"/>
-              </w:rPr>
-            </w:pPr>
-            <w:r>
-              <w:rPr>
-                <w:b/>
-                <w:bCs/>
-                <w:highlight w:val="yellow"/>
+                <w:highlight w:val="magenta"/>
+              </w:rPr>
+            </w:pPr>
+            <w:r>
+              <w:rPr>
+                <w:b/>
+                <w:bCs/>
+                <w:highlight w:val="magenta"/>
               </w:rPr>
               <w:t>Acceptance criteria</w:t>
             </w:r>
             <w:r>
               <w:rPr>
-                <w:highlight w:val="yellow"/>
+                <w:highlight w:val="magenta"/>
               </w:rPr>
               <w:t>:</w:t>
             </w:r>
@@ -2264,12 +2309,12 @@
           <w:p>
             <w:pPr>
               <w:rPr>
-                <w:highlight w:val="yellow"/>
-              </w:rPr>
-            </w:pPr>
-            <w:r>
-              <w:rPr>
-                <w:highlight w:val="yellow"/>
+                <w:highlight w:val="magenta"/>
+              </w:rPr>
+            </w:pPr>
+            <w:r>
+              <w:rPr>
+                <w:highlight w:val="magenta"/>
               </w:rPr>
               <w:t>Help button on the main screen explaining the different tools.</w:t>
             </w:r>
@@ -2277,12 +2322,12 @@
           <w:p>
             <w:pPr>
               <w:rPr>
-                <w:highlight w:val="yellow"/>
-              </w:rPr>
-            </w:pPr>
-            <w:r>
-              <w:rPr>
-                <w:highlight w:val="yellow"/>
+                <w:highlight w:val="magenta"/>
+              </w:rPr>
+            </w:pPr>
+            <w:r>
+              <w:rPr>
+                <w:highlight w:val="magenta"/>
               </w:rPr>
               <w:t>Help button for each specific tool explaining how to perform the tool and how to interpret the results of the tool.</w:t>
             </w:r>
@@ -2293,15 +2338,9 @@
     <w:p>
       <w:pPr>
         <w:pStyle w:val="Heading3"/>
-        <w:rPr>
-          <w:highlight w:val="yellow"/>
-        </w:rPr>
-      </w:pPr>
-      <w:r>
-        <w:rPr>
-          <w:highlight w:val="yellow"/>
-        </w:rPr>
-        <w:t>Statistics of DNA or protein sequence</w:t>
+      </w:pPr>
+      <w:r>
+        <w:t>Upload query FASTA file for BLASTP</w:t>
       </w:r>
     </w:p>
     <w:tbl>
@@ -2319,141 +2358,98 @@
             <w:tcW w:w="8299" w:type="dxa"/>
           </w:tcPr>
           <w:p>
-            <w:pPr>
-              <w:rPr>
-                <w:highlight w:val="yellow"/>
-              </w:rPr>
-            </w:pPr>
-            <w:r>
-              <w:rPr>
-                <w:b/>
-                <w:bCs/>
-                <w:highlight w:val="yellow"/>
-              </w:rPr>
-              <w:t xml:space="preserve">As a </w:t>
-            </w:r>
-            <w:r>
-              <w:rPr>
-                <w:highlight w:val="yellow"/>
-              </w:rPr>
-              <w:t>life science scientist</w:t>
-            </w:r>
-          </w:p>
-        </w:tc>
-      </w:tr>
-      <w:tr>
-        <w:tc>
-          <w:tcPr>
-            <w:tcW w:w="8299" w:type="dxa"/>
-          </w:tcPr>
-          <w:p>
-            <w:pPr>
-              <w:rPr>
-                <w:highlight w:val="yellow"/>
-              </w:rPr>
-            </w:pPr>
-            <w:r>
-              <w:rPr>
-                <w:b/>
-                <w:bCs/>
-                <w:highlight w:val="yellow"/>
+            <w:r>
+              <w:rPr>
+                <w:b/>
+                <w:bCs/>
+              </w:rPr>
+              <w:t>As a</w:t>
+            </w:r>
+            <w:r>
+              <w:t xml:space="preserve"> life science scientist</w:t>
+            </w:r>
+          </w:p>
+        </w:tc>
+      </w:tr>
+      <w:tr>
+        <w:tc>
+          <w:tcPr>
+            <w:tcW w:w="8299" w:type="dxa"/>
+          </w:tcPr>
+          <w:p>
+            <w:r>
+              <w:rPr>
+                <w:b/>
+                <w:bCs/>
               </w:rPr>
               <w:t>I want</w:t>
             </w:r>
             <w:r>
-              <w:rPr>
-                <w:highlight w:val="yellow"/>
-              </w:rPr>
-              <w:t xml:space="preserve"> to </w:t>
-            </w:r>
-            <w:r>
-              <w:rPr>
-                <w:highlight w:val="yellow"/>
-              </w:rPr>
-              <w:t xml:space="preserve">calculate the set of statistics specified in the case description for a given DNA or protein sequence. </w:t>
-            </w:r>
-          </w:p>
-        </w:tc>
-      </w:tr>
-      <w:tr>
-        <w:tc>
-          <w:tcPr>
-            <w:tcW w:w="8299" w:type="dxa"/>
-          </w:tcPr>
-          <w:p>
-            <w:pPr>
-              <w:rPr>
-                <w:highlight w:val="yellow"/>
-              </w:rPr>
-            </w:pPr>
-            <w:r>
-              <w:rPr>
-                <w:b/>
-                <w:bCs/>
-                <w:highlight w:val="yellow"/>
+              <w:t xml:space="preserve"> to upload a FASTA file </w:t>
+            </w:r>
+            <w:r>
+              <w:t>containing</w:t>
+            </w:r>
+            <w:r>
+              <w:t xml:space="preserve"> a protein sequence </w:t>
+            </w:r>
+            <w:r>
+              <w:t xml:space="preserve">in the window for the BLASTP tool </w:t>
+            </w:r>
+          </w:p>
+        </w:tc>
+      </w:tr>
+      <w:tr>
+        <w:tc>
+          <w:tcPr>
+            <w:tcW w:w="8299" w:type="dxa"/>
+          </w:tcPr>
+          <w:p>
+            <w:r>
+              <w:rPr>
+                <w:b/>
+                <w:bCs/>
               </w:rPr>
               <w:t>So that</w:t>
             </w:r>
             <w:r>
-              <w:rPr>
-                <w:highlight w:val="yellow"/>
-              </w:rPr>
-              <w:t xml:space="preserve"> </w:t>
-            </w:r>
-            <w:r>
-              <w:rPr>
-                <w:highlight w:val="yellow"/>
-              </w:rPr>
-              <w:t>I can conveniently analyze some basic properties of my DNA or protein sequence.</w:t>
-            </w:r>
-          </w:p>
-        </w:tc>
-      </w:tr>
-      <w:tr>
-        <w:tc>
-          <w:tcPr>
-            <w:tcW w:w="8299" w:type="dxa"/>
-          </w:tcPr>
-          <w:p>
-            <w:pPr>
-              <w:rPr>
-                <w:highlight w:val="yellow"/>
-              </w:rPr>
-            </w:pPr>
-            <w:r>
-              <w:rPr>
-                <w:b/>
-                <w:bCs/>
-                <w:highlight w:val="yellow"/>
-              </w:rPr>
-              <w:t>Acceptance criteria</w:t>
-            </w:r>
-            <w:r>
-              <w:rPr>
-                <w:highlight w:val="yellow"/>
-              </w:rPr>
-              <w:t>:</w:t>
-            </w:r>
-          </w:p>
-          <w:p>
-            <w:pPr>
-              <w:rPr>
-                <w:highlight w:val="yellow"/>
-              </w:rPr>
-            </w:pPr>
-            <w:r>
-              <w:rPr>
-                <w:highlight w:val="yellow"/>
-              </w:rPr>
-              <w:t>The statistics as specified in the case description are shown on the screen of the statistics tool after the user has entered a DNA or protein sequence in the therefore intended text box and pressed the statistics button afterwards.</w:t>
-            </w:r>
-          </w:p>
-          <w:p>
-            <w:r>
-              <w:rPr>
-                <w:highlight w:val="yellow"/>
-              </w:rPr>
-              <w:t>Error message saying that the user has to enter either a protein or DNA sequence to calculate the statistics is displayed when the statistics button is pressed without providing a sequence.</w:t>
+              <w:t xml:space="preserve"> the BLASTP tool can use this FASTA file as a query</w:t>
+            </w:r>
+            <w:r>
+              <w:t xml:space="preserve"> to search for proteins similar that are similar to my provided query.</w:t>
+            </w:r>
+          </w:p>
+        </w:tc>
+      </w:tr>
+      <w:tr>
+        <w:tc>
+          <w:tcPr>
+            <w:tcW w:w="8299" w:type="dxa"/>
+          </w:tcPr>
+          <w:p>
+            <w:pPr>
+              <w:rPr>
+                <w:b/>
+                <w:bCs/>
+              </w:rPr>
+            </w:pPr>
+            <w:r>
+              <w:rPr>
+                <w:b/>
+                <w:bCs/>
+              </w:rPr>
+              <w:t>Acceptance criteria:</w:t>
+            </w:r>
+          </w:p>
+          <w:p>
+            <w:r>
+              <w:t xml:space="preserve">The user is able to upload its own FASTA file containing a single FASTA sequence after pressing the upload query FASTA file button. To confirm the successful uploading of the query FASTA file, the name of the uploaded file is displayed </w:t>
+            </w:r>
+            <w:r>
+              <w:t xml:space="preserve"> on the </w:t>
+            </w:r>
+            <w:r>
+              <w:t>upload button.</w:t>
             </w:r>
           </w:p>
         </w:tc>
@@ -2462,9 +2458,15 @@
     <w:p>
       <w:pPr>
         <w:pStyle w:val="Heading3"/>
-      </w:pPr>
-      <w:r>
-        <w:t>Upload query FASTA file for BLASTP</w:t>
+        <w:rPr>
+          <w:highlight w:val="magenta"/>
+        </w:rPr>
+      </w:pPr>
+      <w:r>
+        <w:rPr>
+          <w:highlight w:val="magenta"/>
+        </w:rPr>
+        <w:t>Adjust BLASTP parameters</w:t>
       </w:r>
     </w:p>
     <w:tbl>
@@ -2482,14 +2484,23 @@
             <w:tcW w:w="8299" w:type="dxa"/>
           </w:tcPr>
           <w:p>
-            <w:r>
-              <w:rPr>
-                <w:b/>
-                <w:bCs/>
+            <w:pPr>
+              <w:rPr>
+                <w:highlight w:val="magenta"/>
+              </w:rPr>
+            </w:pPr>
+            <w:r>
+              <w:rPr>
+                <w:b/>
+                <w:bCs/>
+                <w:highlight w:val="magenta"/>
               </w:rPr>
               <w:t>As a</w:t>
             </w:r>
             <w:r>
+              <w:rPr>
+                <w:highlight w:val="magenta"/>
+              </w:rPr>
               <w:t xml:space="preserve"> life science scientist</w:t>
             </w:r>
           </w:p>
@@ -2501,79 +2512,84 @@
             <w:tcW w:w="8299" w:type="dxa"/>
           </w:tcPr>
           <w:p>
-            <w:r>
-              <w:rPr>
-                <w:b/>
-                <w:bCs/>
+            <w:pPr>
+              <w:rPr>
+                <w:highlight w:val="magenta"/>
+              </w:rPr>
+            </w:pPr>
+            <w:r>
+              <w:rPr>
+                <w:b/>
+                <w:bCs/>
+                <w:highlight w:val="magenta"/>
               </w:rPr>
               <w:t>I want</w:t>
             </w:r>
             <w:r>
-              <w:t xml:space="preserve"> to upload a FASTA file </w:t>
-            </w:r>
-            <w:r>
-              <w:t>containing</w:t>
-            </w:r>
-            <w:r>
-              <w:t xml:space="preserve"> a protein sequence </w:t>
-            </w:r>
-            <w:r>
-              <w:t xml:space="preserve">in the window for the BLASTP tool </w:t>
-            </w:r>
-          </w:p>
-        </w:tc>
-      </w:tr>
-      <w:tr>
-        <w:tc>
-          <w:tcPr>
-            <w:tcW w:w="8299" w:type="dxa"/>
-          </w:tcPr>
-          <w:p>
-            <w:r>
-              <w:rPr>
-                <w:b/>
-                <w:bCs/>
+              <w:rPr>
+                <w:highlight w:val="magenta"/>
+              </w:rPr>
+              <w:t xml:space="preserve"> to modify some common BLASTP parameters. Specifically, I want to be able to modify the e-value, maximum number of hits, and scoring matrix. Default values must be provided. </w:t>
+            </w:r>
+          </w:p>
+        </w:tc>
+      </w:tr>
+      <w:tr>
+        <w:tc>
+          <w:tcPr>
+            <w:tcW w:w="8299" w:type="dxa"/>
+          </w:tcPr>
+          <w:p>
+            <w:pPr>
+              <w:rPr>
+                <w:highlight w:val="magenta"/>
+              </w:rPr>
+            </w:pPr>
+            <w:r>
+              <w:rPr>
+                <w:b/>
+                <w:bCs/>
+                <w:highlight w:val="magenta"/>
               </w:rPr>
               <w:t>So that</w:t>
             </w:r>
             <w:r>
-              <w:t xml:space="preserve"> the BLASTP tool can use this FASTA file as a query</w:t>
-            </w:r>
-            <w:r>
-              <w:t xml:space="preserve"> to search for proteins similar that are similar to my provided query.</w:t>
-            </w:r>
-          </w:p>
-        </w:tc>
-      </w:tr>
-      <w:tr>
-        <w:tc>
-          <w:tcPr>
-            <w:tcW w:w="8299" w:type="dxa"/>
-          </w:tcPr>
-          <w:p>
-            <w:pPr>
-              <w:rPr>
-                <w:b/>
-                <w:bCs/>
-              </w:rPr>
-            </w:pPr>
-            <w:r>
-              <w:rPr>
-                <w:b/>
-                <w:bCs/>
+              <w:rPr>
+                <w:highlight w:val="magenta"/>
+              </w:rPr>
+              <w:t xml:space="preserve"> the BLASTP tool can run using different parameters, increasing my ability to adjust the BLASTP run to my specific needs.</w:t>
+            </w:r>
+          </w:p>
+        </w:tc>
+      </w:tr>
+      <w:tr>
+        <w:tc>
+          <w:tcPr>
+            <w:tcW w:w="8299" w:type="dxa"/>
+          </w:tcPr>
+          <w:p>
+            <w:pPr>
+              <w:rPr>
+                <w:b/>
+                <w:bCs/>
+                <w:highlight w:val="magenta"/>
+              </w:rPr>
+            </w:pPr>
+            <w:r>
+              <w:rPr>
+                <w:b/>
+                <w:bCs/>
+                <w:highlight w:val="magenta"/>
               </w:rPr>
               <w:t>Acceptance criteria:</w:t>
             </w:r>
           </w:p>
           <w:p>
             <w:r>
-              <w:t xml:space="preserve">The user is able to upload its own FASTA file containing a single FASTA sequence after pressing the upload query FASTA file button. To confirm the successful uploading of the query FASTA file, the name of the uploaded file is displayed </w:t>
-            </w:r>
-            <w:r>
-              <w:t xml:space="preserve"> on the </w:t>
-            </w:r>
-            <w:r>
-              <w:t>upload button.</w:t>
+              <w:rPr>
+                <w:highlight w:val="magenta"/>
+              </w:rPr>
+              <w:t>The user is able to select the e-value, maximum number of hits, and scoring matrix and the BLASTP window. Subsequently, the selected values are used in the BLASTP algorithm. In case of e-value and maximum number of hits, the correct implementation of these parameters can be verified by looking at the BLASTP output. The output should not exceed the specified thresholds.</w:t>
             </w:r>
           </w:p>
         </w:tc>
@@ -2583,14 +2599,28 @@
       <w:pPr>
         <w:pStyle w:val="Heading3"/>
         <w:rPr>
-          <w:highlight w:val="yellow"/>
-        </w:rPr>
-      </w:pPr>
-      <w:r>
-        <w:rPr>
-          <w:highlight w:val="yellow"/>
-        </w:rPr>
-        <w:t>Adjust BLASTP parameters</w:t>
+          <w:highlight w:val="lightGray"/>
+        </w:rPr>
+      </w:pPr>
+      <w:r>
+        <w:rPr>
+          <w:highlight w:val="lightGray"/>
+        </w:rPr>
+        <w:t xml:space="preserve">BLASTP on default </w:t>
+      </w:r>
+      <w:proofErr w:type="spellStart"/>
+      <w:r>
+        <w:rPr>
+          <w:highlight w:val="lightGray"/>
+        </w:rPr>
+        <w:t>Uniprot</w:t>
+      </w:r>
+      <w:proofErr w:type="spellEnd"/>
+      <w:r>
+        <w:rPr>
+          <w:highlight w:val="lightGray"/>
+        </w:rPr>
+        <w:t xml:space="preserve"> database</w:t>
       </w:r>
     </w:p>
     <w:tbl>
@@ -2610,130 +2640,178 @@
           <w:p>
             <w:pPr>
               <w:rPr>
-                <w:highlight w:val="yellow"/>
-              </w:rPr>
-            </w:pPr>
-            <w:r>
-              <w:rPr>
-                <w:b/>
-                <w:bCs/>
-                <w:highlight w:val="yellow"/>
-              </w:rPr>
-              <w:t>As a</w:t>
-            </w:r>
-            <w:r>
-              <w:rPr>
-                <w:highlight w:val="yellow"/>
-              </w:rPr>
-              <w:t xml:space="preserve"> life science scientist</w:t>
-            </w:r>
-          </w:p>
-        </w:tc>
-      </w:tr>
-      <w:tr>
-        <w:tc>
-          <w:tcPr>
-            <w:tcW w:w="8299" w:type="dxa"/>
-          </w:tcPr>
-          <w:p>
-            <w:pPr>
-              <w:rPr>
-                <w:highlight w:val="yellow"/>
-              </w:rPr>
-            </w:pPr>
-            <w:r>
-              <w:rPr>
-                <w:b/>
-                <w:bCs/>
-                <w:highlight w:val="yellow"/>
+                <w:highlight w:val="lightGray"/>
+              </w:rPr>
+            </w:pPr>
+            <w:r>
+              <w:rPr>
+                <w:highlight w:val="lightGray"/>
+              </w:rPr>
+              <w:t>As a life science scientist</w:t>
+            </w:r>
+          </w:p>
+        </w:tc>
+      </w:tr>
+      <w:tr>
+        <w:tc>
+          <w:tcPr>
+            <w:tcW w:w="8299" w:type="dxa"/>
+          </w:tcPr>
+          <w:p>
+            <w:pPr>
+              <w:rPr>
+                <w:highlight w:val="lightGray"/>
+              </w:rPr>
+            </w:pPr>
+            <w:r>
+              <w:rPr>
+                <w:b/>
+                <w:bCs/>
+                <w:highlight w:val="lightGray"/>
               </w:rPr>
               <w:t>I want</w:t>
             </w:r>
             <w:r>
               <w:rPr>
-                <w:highlight w:val="yellow"/>
-              </w:rPr>
-              <w:t xml:space="preserve"> to modify some common BLASTP parameters. Specifically, I want to be able to modify the e-value, maximum number of hits, and scoring matrix. Default values must be provided. </w:t>
-            </w:r>
-          </w:p>
-        </w:tc>
-      </w:tr>
-      <w:tr>
-        <w:tc>
-          <w:tcPr>
-            <w:tcW w:w="8299" w:type="dxa"/>
-          </w:tcPr>
-          <w:p>
-            <w:pPr>
-              <w:rPr>
-                <w:highlight w:val="yellow"/>
-              </w:rPr>
-            </w:pPr>
-            <w:r>
-              <w:rPr>
-                <w:b/>
-                <w:bCs/>
-                <w:highlight w:val="yellow"/>
+                <w:highlight w:val="lightGray"/>
+              </w:rPr>
+              <w:t xml:space="preserve"> to </w:t>
+            </w:r>
+            <w:r>
+              <w:rPr>
+                <w:highlight w:val="lightGray"/>
+              </w:rPr>
+              <w:t xml:space="preserve">perform BLASTP </w:t>
+            </w:r>
+            <w:r>
+              <w:rPr>
+                <w:highlight w:val="lightGray"/>
+              </w:rPr>
+              <w:t xml:space="preserve">using the default </w:t>
+            </w:r>
+            <w:proofErr w:type="spellStart"/>
+            <w:r>
+              <w:rPr>
+                <w:highlight w:val="lightGray"/>
+              </w:rPr>
+              <w:t>Uniprot</w:t>
+            </w:r>
+            <w:proofErr w:type="spellEnd"/>
+            <w:r>
+              <w:rPr>
+                <w:highlight w:val="lightGray"/>
+              </w:rPr>
+              <w:t xml:space="preserve"> database after I entered either a protein sequence in FASTA format in the therefore intended text box or uploaded a FASTA file of a protein sequence. After entering the sequence</w:t>
+            </w:r>
+            <w:r>
+              <w:rPr>
+                <w:highlight w:val="lightGray"/>
+              </w:rPr>
+              <w:t>,</w:t>
+            </w:r>
+            <w:r>
+              <w:rPr>
+                <w:highlight w:val="lightGray"/>
+              </w:rPr>
+              <w:t xml:space="preserve"> I want to press the BLAST button to run the BLASTP.</w:t>
+            </w:r>
+          </w:p>
+        </w:tc>
+      </w:tr>
+      <w:tr>
+        <w:tc>
+          <w:tcPr>
+            <w:tcW w:w="8299" w:type="dxa"/>
+          </w:tcPr>
+          <w:p>
+            <w:pPr>
+              <w:rPr>
+                <w:highlight w:val="lightGray"/>
+              </w:rPr>
+            </w:pPr>
+            <w:r>
+              <w:rPr>
+                <w:b/>
+                <w:bCs/>
+                <w:highlight w:val="lightGray"/>
               </w:rPr>
               <w:t>So that</w:t>
             </w:r>
             <w:r>
               <w:rPr>
-                <w:highlight w:val="yellow"/>
-              </w:rPr>
-              <w:t xml:space="preserve"> the BLASTP tool can run using different parameters, increasing my ability to adjust the BLASTP run to my specific needs.</w:t>
-            </w:r>
-          </w:p>
-        </w:tc>
-      </w:tr>
-      <w:tr>
-        <w:tc>
-          <w:tcPr>
-            <w:tcW w:w="8299" w:type="dxa"/>
-          </w:tcPr>
-          <w:p>
-            <w:pPr>
-              <w:rPr>
-                <w:b/>
-                <w:bCs/>
-                <w:highlight w:val="yellow"/>
-              </w:rPr>
-            </w:pPr>
-            <w:r>
-              <w:rPr>
-                <w:b/>
-                <w:bCs/>
-                <w:highlight w:val="yellow"/>
+                <w:highlight w:val="lightGray"/>
+              </w:rPr>
+              <w:t xml:space="preserve"> </w:t>
+            </w:r>
+            <w:r>
+              <w:rPr>
+                <w:highlight w:val="lightGray"/>
+              </w:rPr>
+              <w:t xml:space="preserve">I can analyze, using the BLASTP output, which proteins are similar to my query sequence and from what organism these proteins are. </w:t>
+            </w:r>
+          </w:p>
+        </w:tc>
+      </w:tr>
+      <w:tr>
+        <w:tc>
+          <w:tcPr>
+            <w:tcW w:w="8299" w:type="dxa"/>
+          </w:tcPr>
+          <w:p>
+            <w:pPr>
+              <w:rPr>
+                <w:b/>
+                <w:bCs/>
+                <w:highlight w:val="lightGray"/>
+              </w:rPr>
+            </w:pPr>
+            <w:r>
+              <w:rPr>
+                <w:b/>
+                <w:bCs/>
+                <w:highlight w:val="lightGray"/>
               </w:rPr>
               <w:t>Acceptance criteria:</w:t>
             </w:r>
           </w:p>
           <w:p>
-            <w:r>
-              <w:rPr>
-                <w:highlight w:val="yellow"/>
-              </w:rPr>
-              <w:t>The user is able to select the e-value, maximum number of hits, and scoring matrix and the BLASTP window. Subsequently, the selected values are used in the BLASTP algorithm. In case of e-value and maximum number of hits, the correct implementation of these parameters can be verified by looking at the BLASTP output. The output should not exceed the specified thresholds.</w:t>
+            <w:pPr>
+              <w:rPr>
+                <w:highlight w:val="lightGray"/>
+              </w:rPr>
+            </w:pPr>
+            <w:r>
+              <w:rPr>
+                <w:highlight w:val="lightGray"/>
+              </w:rPr>
+              <w:t>After I put in either a protein sequence in FASTA format in the therefore intended text box or upload a FASTA file of a protein sequence and press the BLAST button, the BLASTP output should be written to a file in my downloads folder and shown in a new window.</w:t>
+            </w:r>
+          </w:p>
+          <w:p>
+            <w:r>
+              <w:rPr>
+                <w:highlight w:val="lightGray"/>
+              </w:rPr>
+              <w:lastRenderedPageBreak/>
+              <w:t>Error message saying that the user has to either enter a protein in FASTA file format in the text box or upload a query FASTA file when the user presses the BLAST button without providing a query sequence.</w:t>
             </w:r>
           </w:p>
         </w:tc>
       </w:tr>
     </w:tbl>
+    <w:p/>
     <w:p>
       <w:pPr>
         <w:pStyle w:val="Heading3"/>
-      </w:pPr>
-      <w:r>
-        <w:lastRenderedPageBreak/>
-        <w:t xml:space="preserve">BLASTP on default </w:t>
-      </w:r>
-      <w:proofErr w:type="spellStart"/>
-      <w:r>
-        <w:t>Uniprot</w:t>
-      </w:r>
-      <w:proofErr w:type="spellEnd"/>
-      <w:r>
-        <w:t xml:space="preserve"> database</w:t>
+        <w:rPr>
+          <w:highlight w:val="lightGray"/>
+        </w:rPr>
+      </w:pPr>
+      <w:r>
+        <w:rPr>
+          <w:highlight w:val="lightGray"/>
+        </w:rPr>
+        <w:t>BLASTP on database provided by the user</w:t>
       </w:r>
     </w:p>
     <w:tbl>
@@ -2751,113 +2829,336 @@
             <w:tcW w:w="8299" w:type="dxa"/>
           </w:tcPr>
           <w:p>
-            <w:r>
-              <w:t>As a life science scientist</w:t>
-            </w:r>
-          </w:p>
-        </w:tc>
-      </w:tr>
-      <w:tr>
-        <w:tc>
-          <w:tcPr>
-            <w:tcW w:w="8299" w:type="dxa"/>
-          </w:tcPr>
-          <w:p>
-            <w:r>
-              <w:rPr>
-                <w:b/>
-                <w:bCs/>
+            <w:pPr>
+              <w:rPr>
+                <w:highlight w:val="lightGray"/>
+              </w:rPr>
+            </w:pPr>
+            <w:r>
+              <w:rPr>
+                <w:b/>
+                <w:bCs/>
+                <w:highlight w:val="lightGray"/>
+              </w:rPr>
+              <w:t>As a</w:t>
+            </w:r>
+            <w:r>
+              <w:rPr>
+                <w:highlight w:val="lightGray"/>
+              </w:rPr>
+              <w:t xml:space="preserve"> </w:t>
+            </w:r>
+            <w:r>
+              <w:rPr>
+                <w:highlight w:val="lightGray"/>
+              </w:rPr>
+              <w:t>life science scientist</w:t>
+            </w:r>
+          </w:p>
+        </w:tc>
+      </w:tr>
+      <w:tr>
+        <w:tc>
+          <w:tcPr>
+            <w:tcW w:w="8299" w:type="dxa"/>
+          </w:tcPr>
+          <w:p>
+            <w:pPr>
+              <w:rPr>
+                <w:highlight w:val="lightGray"/>
+              </w:rPr>
+            </w:pPr>
+            <w:r>
+              <w:rPr>
+                <w:b/>
+                <w:bCs/>
+                <w:highlight w:val="lightGray"/>
               </w:rPr>
               <w:t>I want</w:t>
             </w:r>
             <w:r>
+              <w:rPr>
+                <w:highlight w:val="lightGray"/>
+              </w:rPr>
               <w:t xml:space="preserve"> to </w:t>
             </w:r>
             <w:r>
-              <w:t xml:space="preserve">perform BLASTP </w:t>
-            </w:r>
-            <w:r>
-              <w:t xml:space="preserve">using the default </w:t>
+              <w:rPr>
+                <w:highlight w:val="lightGray"/>
+              </w:rPr>
+              <w:t xml:space="preserve">run the BLASTP tool using my own custom database provided in FASTA format. As with the default </w:t>
             </w:r>
             <w:proofErr w:type="spellStart"/>
             <w:r>
+              <w:rPr>
+                <w:highlight w:val="lightGray"/>
+              </w:rPr>
               <w:t>Uniprot</w:t>
             </w:r>
             <w:proofErr w:type="spellEnd"/>
             <w:r>
-              <w:t xml:space="preserve"> database after I entered either a protein sequence in FASTA format in the therefore intended text box or uploaded a FASTA file of a protein sequence. After entering the sequence</w:t>
-            </w:r>
-            <w:r>
-              <w:t>,</w:t>
-            </w:r>
-            <w:r>
-              <w:t xml:space="preserve"> I want to press the BLAST button to run the BLASTP.</w:t>
-            </w:r>
-          </w:p>
-        </w:tc>
-      </w:tr>
-      <w:tr>
-        <w:tc>
-          <w:tcPr>
-            <w:tcW w:w="8299" w:type="dxa"/>
-          </w:tcPr>
-          <w:p>
-            <w:r>
-              <w:rPr>
-                <w:b/>
-                <w:bCs/>
+              <w:rPr>
+                <w:highlight w:val="lightGray"/>
+              </w:rPr>
+              <w:t xml:space="preserve"> database, the query protein sequence can be provided in text box in FASTA format or uploaded as a FASTA file. When I press the BLAST button, the BLASTP should run using my custom database.  </w:t>
+            </w:r>
+          </w:p>
+        </w:tc>
+      </w:tr>
+      <w:tr>
+        <w:tc>
+          <w:tcPr>
+            <w:tcW w:w="8299" w:type="dxa"/>
+          </w:tcPr>
+          <w:p>
+            <w:pPr>
+              <w:rPr>
+                <w:highlight w:val="lightGray"/>
+              </w:rPr>
+            </w:pPr>
+            <w:r>
+              <w:rPr>
+                <w:b/>
+                <w:bCs/>
+                <w:highlight w:val="lightGray"/>
               </w:rPr>
               <w:t>So that</w:t>
             </w:r>
             <w:r>
+              <w:rPr>
+                <w:highlight w:val="lightGray"/>
+              </w:rPr>
               <w:t xml:space="preserve"> </w:t>
             </w:r>
             <w:r>
-              <w:t xml:space="preserve">I can analyze, using the BLASTP output, which proteins are similar to my query sequence and from what organism these proteins are. </w:t>
-            </w:r>
-          </w:p>
-        </w:tc>
-      </w:tr>
-      <w:tr>
-        <w:tc>
-          <w:tcPr>
-            <w:tcW w:w="8299" w:type="dxa"/>
-          </w:tcPr>
-          <w:p>
-            <w:pPr>
-              <w:rPr>
-                <w:b/>
-                <w:bCs/>
-              </w:rPr>
-            </w:pPr>
-            <w:r>
-              <w:rPr>
-                <w:b/>
-                <w:bCs/>
-              </w:rPr>
-              <w:t>Acceptance criteria:</w:t>
-            </w:r>
-          </w:p>
-          <w:p>
-            <w:r>
-              <w:t>After I put in either a protein sequence in FASTA format in the therefore intended text box or upload a FASTA file of a protein sequence and press the BLAST button, the BLASTP output should be written to a file in my downloads folder and shown in a new window.</w:t>
-            </w:r>
-          </w:p>
-          <w:p>
-            <w:r>
-              <w:t>Error message saying that the user has to either enter a protein in FASTA file format in the text box or upload a query FASTA file when the user presses the BLAST button without providing a query sequence.</w:t>
+              <w:rPr>
+                <w:highlight w:val="lightGray"/>
+              </w:rPr>
+              <w:t>I can analyze, using the BLASTP output, which proteins are similar to my query sequence and from what organism these proteins are.</w:t>
+            </w:r>
+          </w:p>
+        </w:tc>
+      </w:tr>
+      <w:tr>
+        <w:tc>
+          <w:tcPr>
+            <w:tcW w:w="8299" w:type="dxa"/>
+          </w:tcPr>
+          <w:p>
+            <w:pPr>
+              <w:rPr>
+                <w:highlight w:val="lightGray"/>
+              </w:rPr>
+            </w:pPr>
+            <w:r>
+              <w:rPr>
+                <w:b/>
+                <w:bCs/>
+                <w:highlight w:val="lightGray"/>
+              </w:rPr>
+              <w:t>Acceptance criteria</w:t>
+            </w:r>
+            <w:r>
+              <w:rPr>
+                <w:highlight w:val="lightGray"/>
+              </w:rPr>
+              <w:t>:</w:t>
+            </w:r>
+          </w:p>
+          <w:p>
+            <w:r>
+              <w:rPr>
+                <w:highlight w:val="lightGray"/>
+              </w:rPr>
+              <w:t xml:space="preserve">After I put in either a protein sequence in FASTA format in the therefore intended text box or upload a FASTA file of a protein sequence and provide a custom database in FASTA format, the BLASTP output should be written to a file in my downloads folder and shown in a new window when I press the BLAST button. Importantly, it should not use the default </w:t>
+            </w:r>
+            <w:proofErr w:type="spellStart"/>
+            <w:r>
+              <w:rPr>
+                <w:highlight w:val="lightGray"/>
+              </w:rPr>
+              <w:t>Uniprot</w:t>
+            </w:r>
+            <w:proofErr w:type="spellEnd"/>
+            <w:r>
+              <w:rPr>
+                <w:highlight w:val="lightGray"/>
+              </w:rPr>
+              <w:t xml:space="preserve"> database when I provide my own database.</w:t>
             </w:r>
           </w:p>
         </w:tc>
       </w:tr>
     </w:tbl>
     <w:p/>
+    <w:p/>
     <w:p>
       <w:pPr>
-        <w:pStyle w:val="Heading3"/>
-      </w:pPr>
-      <w:r>
-        <w:t>BLASTP on database provided by the user</w:t>
+        <w:rPr>
+          <w:rFonts w:ascii="Arial" w:hAnsi="Arial" w:cs="Arial"/>
+          <w:b/>
+          <w:bCs/>
+          <w:i/>
+          <w:iCs/>
+          <w:sz w:val="28"/>
+          <w:szCs w:val="24"/>
+        </w:rPr>
+      </w:pPr>
+    </w:p>
+    <w:p>
+      <w:pPr>
+        <w:rPr>
+          <w:rFonts w:ascii="Arial" w:hAnsi="Arial" w:cs="Arial"/>
+          <w:b/>
+          <w:bCs/>
+          <w:i/>
+          <w:iCs/>
+          <w:sz w:val="28"/>
+          <w:szCs w:val="24"/>
+        </w:rPr>
+      </w:pPr>
+      <w:r>
+        <w:rPr>
+          <w:rFonts w:ascii="Arial" w:hAnsi="Arial" w:cs="Arial"/>
+          <w:b/>
+          <w:bCs/>
+          <w:i/>
+          <w:iCs/>
+          <w:sz w:val="28"/>
+          <w:szCs w:val="24"/>
+        </w:rPr>
+        <w:br w:type="page"/>
+      </w:r>
+    </w:p>
+    <w:p>
+      <w:pPr>
+        <w:rPr>
+          <w:rFonts w:ascii="Arial" w:hAnsi="Arial" w:cs="Arial"/>
+          <w:b/>
+          <w:bCs/>
+          <w:sz w:val="36"/>
+          <w:szCs w:val="32"/>
+        </w:rPr>
+      </w:pPr>
+      <w:r>
+        <w:rPr>
+          <w:rFonts w:ascii="Arial" w:hAnsi="Arial" w:cs="Arial"/>
+          <w:b/>
+          <w:bCs/>
+          <w:sz w:val="36"/>
+          <w:szCs w:val="32"/>
+        </w:rPr>
+        <w:lastRenderedPageBreak/>
+        <w:t>Iteration 1</w:t>
+      </w:r>
+    </w:p>
+    <w:p>
+      <w:pPr>
+        <w:pStyle w:val="Heading2"/>
+      </w:pPr>
+      <w:r>
+        <w:t>User stories</w:t>
+      </w:r>
+    </w:p>
+    <w:p>
+      <w:pPr>
+        <w:rPr>
+          <w:b/>
+          <w:bCs/>
+        </w:rPr>
+      </w:pPr>
+      <w:r>
+        <w:rPr>
+          <w:b/>
+          <w:bCs/>
+        </w:rPr>
+        <w:t xml:space="preserve">Group A: </w:t>
+      </w:r>
+      <w:proofErr w:type="spellStart"/>
+      <w:r>
+        <w:rPr>
+          <w:b/>
+          <w:bCs/>
+        </w:rPr>
+        <w:t>EzBLAST</w:t>
+      </w:r>
+      <w:proofErr w:type="spellEnd"/>
+    </w:p>
+    <w:p>
+      <w:pPr>
+        <w:rPr>
+          <w:b/>
+          <w:bCs/>
+        </w:rPr>
+      </w:pPr>
+    </w:p>
+    <w:p>
+      <w:pPr>
+        <w:rPr>
+          <w:b/>
+          <w:bCs/>
+          <w:i/>
+          <w:iCs/>
+        </w:rPr>
+      </w:pPr>
+      <w:r>
+        <w:rPr>
+          <w:b/>
+          <w:bCs/>
+          <w:i/>
+          <w:iCs/>
+        </w:rPr>
+        <w:t>Case description</w:t>
+      </w:r>
+    </w:p>
+    <w:p>
+      <w:r>
+        <w:t xml:space="preserve">The user is a life science scientist and wants to analyze their data. In this instance, we limit the input data to a </w:t>
+      </w:r>
+      <w:proofErr w:type="spellStart"/>
+      <w:r>
+        <w:t>fasta</w:t>
+      </w:r>
+      <w:proofErr w:type="spellEnd"/>
+      <w:r>
+        <w:t xml:space="preserve"> sequence of an unknown organism. </w:t>
+      </w:r>
+    </w:p>
+    <w:p/>
+    <w:p>
+      <w:pPr>
+        <w:rPr>
+          <w:b/>
+          <w:bCs/>
+          <w:i/>
+          <w:iCs/>
+        </w:rPr>
+      </w:pPr>
+      <w:r>
+        <w:rPr>
+          <w:b/>
+          <w:bCs/>
+          <w:i/>
+          <w:iCs/>
+        </w:rPr>
+        <w:t>User stories</w:t>
+      </w:r>
+    </w:p>
+    <w:p>
+      <w:pPr>
+        <w:rPr>
+          <w:b/>
+          <w:bCs/>
+          <w:highlight w:val="darkGreen"/>
+        </w:rPr>
+      </w:pPr>
+      <w:r>
+        <w:rPr>
+          <w:b/>
+          <w:bCs/>
+          <w:highlight w:val="darkGreen"/>
+        </w:rPr>
+        <w:t>Upload database</w:t>
       </w:r>
     </w:p>
     <w:tbl>
@@ -2873,278 +3174,179 @@
         <w:tc>
           <w:tcPr>
             <w:tcW w:w="8299" w:type="dxa"/>
-          </w:tcPr>
-          <w:p>
-            <w:r>
-              <w:rPr>
-                <w:b/>
-                <w:bCs/>
-              </w:rPr>
-              <w:t>As a</w:t>
-            </w:r>
-            <w:r>
-              <w:t xml:space="preserve"> </w:t>
-            </w:r>
-            <w:r>
-              <w:t>life science scientist</w:t>
-            </w:r>
-          </w:p>
-        </w:tc>
-      </w:tr>
-      <w:tr>
-        <w:tc>
-          <w:tcPr>
-            <w:tcW w:w="8299" w:type="dxa"/>
-          </w:tcPr>
-          <w:p>
-            <w:r>
-              <w:rPr>
-                <w:b/>
-                <w:bCs/>
-              </w:rPr>
-              <w:t>I want</w:t>
-            </w:r>
-            <w:r>
-              <w:t xml:space="preserve"> to </w:t>
-            </w:r>
-            <w:r>
-              <w:t xml:space="preserve">run the BLASTP tool using my own custom database provided in FASTA format. As with the default </w:t>
-            </w:r>
-            <w:proofErr w:type="spellStart"/>
-            <w:r>
-              <w:t>Uniprot</w:t>
-            </w:r>
-            <w:proofErr w:type="spellEnd"/>
-            <w:r>
-              <w:t xml:space="preserve"> database, the query protein sequence can be provided in text box in FASTA format or uploaded as a FASTA file. When I press the BLAST button, the BLASTP should run using my custom database.  </w:t>
-            </w:r>
-          </w:p>
-        </w:tc>
-      </w:tr>
-      <w:tr>
-        <w:tc>
-          <w:tcPr>
-            <w:tcW w:w="8299" w:type="dxa"/>
-          </w:tcPr>
-          <w:p>
-            <w:r>
-              <w:rPr>
-                <w:b/>
-                <w:bCs/>
-              </w:rPr>
-              <w:t>So that</w:t>
-            </w:r>
-            <w:r>
-              <w:t xml:space="preserve"> </w:t>
-            </w:r>
-            <w:r>
-              <w:t>I can analyze, using the BLASTP output, which proteins are similar to my query sequence and from what organism these proteins are.</w:t>
-            </w:r>
-          </w:p>
-        </w:tc>
-      </w:tr>
-      <w:tr>
-        <w:tc>
-          <w:tcPr>
-            <w:tcW w:w="8299" w:type="dxa"/>
-          </w:tcPr>
-          <w:p>
-            <w:r>
-              <w:rPr>
-                <w:b/>
-                <w:bCs/>
-              </w:rPr>
-              <w:t>Acceptance criteria</w:t>
-            </w:r>
-            <w:r>
-              <w:t>:</w:t>
-            </w:r>
-          </w:p>
-          <w:p>
-            <w:r>
-              <w:t xml:space="preserve">After I put in either a protein sequence in FASTA format in the therefore intended text box or upload a FASTA file of a protein sequence and provide a custom database in FASTA format, the BLASTP output should be written to a file in my downloads folder and shown in a new window when I press the BLAST button. Importantly, it should not use the default </w:t>
-            </w:r>
-            <w:proofErr w:type="spellStart"/>
-            <w:r>
-              <w:t>Uniprot</w:t>
-            </w:r>
-            <w:proofErr w:type="spellEnd"/>
-            <w:r>
-              <w:t xml:space="preserve"> database when I provide my own database.</w:t>
+            <w:tcBorders>
+              <w:top w:val="single" w:sz="4" w:space="0" w:color="auto"/>
+              <w:left w:val="single" w:sz="4" w:space="0" w:color="auto"/>
+              <w:bottom w:val="single" w:sz="4" w:space="0" w:color="auto"/>
+              <w:right w:val="single" w:sz="4" w:space="0" w:color="auto"/>
+            </w:tcBorders>
+            <w:hideMark/>
+          </w:tcPr>
+          <w:p>
+            <w:pPr>
+              <w:rPr>
+                <w:highlight w:val="darkGreen"/>
+              </w:rPr>
+            </w:pPr>
+            <w:r>
+              <w:rPr>
+                <w:highlight w:val="darkGreen"/>
+              </w:rPr>
+              <w:t>As a researcher</w:t>
+            </w:r>
+          </w:p>
+        </w:tc>
+      </w:tr>
+      <w:tr>
+        <w:tc>
+          <w:tcPr>
+            <w:tcW w:w="8299" w:type="dxa"/>
+            <w:tcBorders>
+              <w:top w:val="single" w:sz="4" w:space="0" w:color="auto"/>
+              <w:left w:val="single" w:sz="4" w:space="0" w:color="auto"/>
+              <w:bottom w:val="single" w:sz="4" w:space="0" w:color="auto"/>
+              <w:right w:val="single" w:sz="4" w:space="0" w:color="auto"/>
+            </w:tcBorders>
+            <w:hideMark/>
+          </w:tcPr>
+          <w:p>
+            <w:pPr>
+              <w:rPr>
+                <w:highlight w:val="darkGreen"/>
+              </w:rPr>
+            </w:pPr>
+            <w:r>
+              <w:rPr>
+                <w:highlight w:val="darkGreen"/>
+              </w:rPr>
+              <w:t>I want to add a / my database of protein / nucleotide sequences</w:t>
+            </w:r>
+          </w:p>
+        </w:tc>
+      </w:tr>
+      <w:tr>
+        <w:tc>
+          <w:tcPr>
+            <w:tcW w:w="8299" w:type="dxa"/>
+            <w:tcBorders>
+              <w:top w:val="single" w:sz="4" w:space="0" w:color="auto"/>
+              <w:left w:val="single" w:sz="4" w:space="0" w:color="auto"/>
+              <w:bottom w:val="single" w:sz="4" w:space="0" w:color="auto"/>
+              <w:right w:val="single" w:sz="4" w:space="0" w:color="auto"/>
+            </w:tcBorders>
+            <w:hideMark/>
+          </w:tcPr>
+          <w:p>
+            <w:pPr>
+              <w:rPr>
+                <w:highlight w:val="darkGreen"/>
+              </w:rPr>
+            </w:pPr>
+            <w:r>
+              <w:rPr>
+                <w:highlight w:val="darkGreen"/>
+              </w:rPr>
+              <w:t>So that I can query my sequence(s) against the sequences in the  database to determine sequence homology</w:t>
+            </w:r>
+          </w:p>
+        </w:tc>
+      </w:tr>
+      <w:tr>
+        <w:tc>
+          <w:tcPr>
+            <w:tcW w:w="8299" w:type="dxa"/>
+            <w:tcBorders>
+              <w:top w:val="single" w:sz="4" w:space="0" w:color="auto"/>
+              <w:left w:val="single" w:sz="4" w:space="0" w:color="auto"/>
+              <w:bottom w:val="single" w:sz="4" w:space="0" w:color="auto"/>
+              <w:right w:val="single" w:sz="4" w:space="0" w:color="auto"/>
+            </w:tcBorders>
+            <w:hideMark/>
+          </w:tcPr>
+          <w:p>
+            <w:pPr>
+              <w:rPr>
+                <w:highlight w:val="darkGreen"/>
+              </w:rPr>
+            </w:pPr>
+            <w:r>
+              <w:rPr>
+                <w:highlight w:val="darkGreen"/>
+              </w:rPr>
+              <w:t>Acceptance criteria:</w:t>
+            </w:r>
+          </w:p>
+          <w:p>
+            <w:pPr>
+              <w:rPr>
+                <w:highlight w:val="darkGreen"/>
+              </w:rPr>
+            </w:pPr>
+            <w:r>
+              <w:rPr>
+                <w:highlight w:val="darkGreen"/>
+              </w:rPr>
+              <w:t xml:space="preserve">Hardcoded database, test with sequence to see if BLAST works </w:t>
+            </w:r>
+          </w:p>
+        </w:tc>
+      </w:tr>
+      <w:tr>
+        <w:tc>
+          <w:tcPr>
+            <w:tcW w:w="8299" w:type="dxa"/>
+            <w:tcBorders>
+              <w:top w:val="single" w:sz="4" w:space="0" w:color="auto"/>
+              <w:left w:val="single" w:sz="4" w:space="0" w:color="auto"/>
+              <w:bottom w:val="single" w:sz="4" w:space="0" w:color="auto"/>
+              <w:right w:val="single" w:sz="4" w:space="0" w:color="auto"/>
+            </w:tcBorders>
+            <w:hideMark/>
+          </w:tcPr>
+          <w:p>
+            <w:pPr>
+              <w:rPr>
+                <w:highlight w:val="darkGreen"/>
+              </w:rPr>
+            </w:pPr>
+            <w:r>
+              <w:rPr>
+                <w:highlight w:val="darkGreen"/>
+              </w:rPr>
+              <w:t>Acceptance test (exact description):</w:t>
+            </w:r>
+          </w:p>
+          <w:p>
+            <w:pPr>
+              <w:rPr>
+                <w:highlight w:val="darkGreen"/>
+              </w:rPr>
+            </w:pPr>
+            <w:r>
+              <w:rPr>
+                <w:highlight w:val="darkGreen"/>
+              </w:rPr>
+              <w:t>...</w:t>
             </w:r>
           </w:p>
         </w:tc>
       </w:tr>
     </w:tbl>
-    <w:p/>
-    <w:p/>
     <w:p>
       <w:pPr>
         <w:rPr>
-          <w:rFonts w:ascii="Arial" w:hAnsi="Arial" w:cs="Arial"/>
           <w:b/>
           <w:bCs/>
-          <w:i/>
-          <w:iCs/>
-          <w:sz w:val="28"/>
-          <w:szCs w:val="24"/>
-        </w:rPr>
-      </w:pPr>
-    </w:p>
-    <w:p>
-      <w:pPr>
-        <w:rPr>
-          <w:rFonts w:ascii="Arial" w:hAnsi="Arial" w:cs="Arial"/>
+          <w:highlight w:val="darkGreen"/>
+        </w:rPr>
+      </w:pPr>
+      <w:r>
+        <w:rPr>
           <w:b/>
           <w:bCs/>
-          <w:i/>
-          <w:iCs/>
-          <w:sz w:val="28"/>
-          <w:szCs w:val="24"/>
-        </w:rPr>
-      </w:pPr>
-      <w:r>
-        <w:rPr>
-          <w:rFonts w:ascii="Arial" w:hAnsi="Arial" w:cs="Arial"/>
-          <w:b/>
-          <w:bCs/>
-          <w:i/>
-          <w:iCs/>
-          <w:sz w:val="28"/>
-          <w:szCs w:val="24"/>
-        </w:rPr>
-        <w:br w:type="page"/>
-      </w:r>
-    </w:p>
-    <w:p>
-      <w:pPr>
-        <w:rPr>
-          <w:rFonts w:ascii="Arial" w:hAnsi="Arial" w:cs="Arial"/>
-          <w:b/>
-          <w:bCs/>
-          <w:sz w:val="36"/>
-          <w:szCs w:val="32"/>
-        </w:rPr>
-      </w:pPr>
-      <w:r>
-        <w:rPr>
-          <w:rFonts w:ascii="Arial" w:hAnsi="Arial" w:cs="Arial"/>
-          <w:b/>
-          <w:bCs/>
-          <w:sz w:val="36"/>
-          <w:szCs w:val="32"/>
-        </w:rPr>
-        <w:lastRenderedPageBreak/>
-        <w:t>Iteration 1</w:t>
-      </w:r>
-    </w:p>
-    <w:p>
-      <w:pPr>
-        <w:pStyle w:val="Heading2"/>
-      </w:pPr>
-      <w:r>
-        <w:t>User stories</w:t>
-      </w:r>
-    </w:p>
-    <w:p>
-      <w:pPr>
-        <w:rPr>
-          <w:b/>
-          <w:bCs/>
-        </w:rPr>
-      </w:pPr>
-      <w:r>
-        <w:rPr>
-          <w:b/>
-          <w:bCs/>
-        </w:rPr>
-        <w:t xml:space="preserve">Group A: </w:t>
-      </w:r>
-      <w:proofErr w:type="spellStart"/>
-      <w:r>
-        <w:rPr>
-          <w:b/>
-          <w:bCs/>
-        </w:rPr>
-        <w:t>EzBLAST</w:t>
-      </w:r>
-      <w:proofErr w:type="spellEnd"/>
-    </w:p>
-    <w:p>
-      <w:pPr>
-        <w:rPr>
-          <w:b/>
-          <w:bCs/>
-        </w:rPr>
-      </w:pPr>
-    </w:p>
-    <w:p>
-      <w:pPr>
-        <w:rPr>
-          <w:b/>
-          <w:bCs/>
-          <w:i/>
-          <w:iCs/>
-        </w:rPr>
-      </w:pPr>
-      <w:r>
-        <w:rPr>
-          <w:b/>
-          <w:bCs/>
-          <w:i/>
-          <w:iCs/>
-        </w:rPr>
-        <w:t>Case description</w:t>
-      </w:r>
-    </w:p>
-    <w:p>
-      <w:r>
-        <w:t xml:space="preserve">The user is a life science scientist and wants to analyze their data. In this instance, we limit the input data to a </w:t>
-      </w:r>
-      <w:proofErr w:type="spellStart"/>
-      <w:r>
-        <w:t>fasta</w:t>
-      </w:r>
-      <w:proofErr w:type="spellEnd"/>
-      <w:r>
-        <w:t xml:space="preserve"> sequence of an unknown organism. </w:t>
-      </w:r>
-    </w:p>
-    <w:p/>
-    <w:p>
-      <w:pPr>
-        <w:rPr>
-          <w:b/>
-          <w:bCs/>
-          <w:i/>
-          <w:iCs/>
-        </w:rPr>
-      </w:pPr>
-      <w:r>
-        <w:rPr>
-          <w:b/>
-          <w:bCs/>
-          <w:i/>
-          <w:iCs/>
-        </w:rPr>
-        <w:t>User stories</w:t>
-      </w:r>
-    </w:p>
-    <w:p>
-      <w:pPr>
-        <w:rPr>
-          <w:b/>
-          <w:bCs/>
-          <w:highlight w:val="yellow"/>
-        </w:rPr>
-      </w:pPr>
-      <w:r>
-        <w:rPr>
-          <w:b/>
-          <w:bCs/>
-          <w:highlight w:val="yellow"/>
-        </w:rPr>
-        <w:t>Upload database</w:t>
+          <w:highlight w:val="darkGreen"/>
+        </w:rPr>
+        <w:t>Input field for sequence</w:t>
       </w:r>
     </w:p>
     <w:tbl>
@@ -3171,14 +3373,14 @@
           <w:p>
             <w:pPr>
               <w:rPr>
-                <w:highlight w:val="yellow"/>
-              </w:rPr>
-            </w:pPr>
-            <w:r>
-              <w:rPr>
-                <w:highlight w:val="yellow"/>
-              </w:rPr>
-              <w:t>As a researcher</w:t>
+                <w:highlight w:val="darkGreen"/>
+              </w:rPr>
+            </w:pPr>
+            <w:r>
+              <w:rPr>
+                <w:highlight w:val="darkGreen"/>
+              </w:rPr>
+              <w:t>As a Biologist</w:t>
             </w:r>
           </w:p>
         </w:tc>
@@ -3198,14 +3400,14 @@
           <w:p>
             <w:pPr>
               <w:rPr>
-                <w:highlight w:val="yellow"/>
-              </w:rPr>
-            </w:pPr>
-            <w:r>
-              <w:rPr>
-                <w:highlight w:val="yellow"/>
-              </w:rPr>
-              <w:t>I want to add a / my database of protein / nucleotide sequences</w:t>
+                <w:highlight w:val="darkGreen"/>
+              </w:rPr>
+            </w:pPr>
+            <w:r>
+              <w:rPr>
+                <w:highlight w:val="darkGreen"/>
+              </w:rPr>
+              <w:t>I want to have a test field to input my sequence</w:t>
             </w:r>
           </w:p>
         </w:tc>
@@ -3225,14 +3427,14 @@
           <w:p>
             <w:pPr>
               <w:rPr>
-                <w:highlight w:val="yellow"/>
-              </w:rPr>
-            </w:pPr>
-            <w:r>
-              <w:rPr>
-                <w:highlight w:val="yellow"/>
-              </w:rPr>
-              <w:t>So that I can query my sequence(s) against the sequences in the  database to determine sequence homology</w:t>
+                <w:highlight w:val="darkGreen"/>
+              </w:rPr>
+            </w:pPr>
+            <w:r>
+              <w:rPr>
+                <w:highlight w:val="darkGreen"/>
+              </w:rPr>
+              <w:t>So that I can run BLAST on a sequence without having to add it to a BLAST file.</w:t>
             </w:r>
           </w:p>
         </w:tc>
@@ -3247,17 +3449,16 @@
               <w:bottom w:val="single" w:sz="4" w:space="0" w:color="auto"/>
               <w:right w:val="single" w:sz="4" w:space="0" w:color="auto"/>
             </w:tcBorders>
-            <w:hideMark/>
-          </w:tcPr>
-          <w:p>
-            <w:pPr>
-              <w:rPr>
-                <w:highlight w:val="yellow"/>
-              </w:rPr>
-            </w:pPr>
-            <w:r>
-              <w:rPr>
-                <w:highlight w:val="yellow"/>
+          </w:tcPr>
+          <w:p>
+            <w:pPr>
+              <w:rPr>
+                <w:highlight w:val="darkGreen"/>
+              </w:rPr>
+            </w:pPr>
+            <w:r>
+              <w:rPr>
+                <w:highlight w:val="darkGreen"/>
               </w:rPr>
               <w:t>Acceptance criteria:</w:t>
             </w:r>
@@ -3265,15 +3466,9 @@
           <w:p>
             <w:pPr>
               <w:rPr>
-                <w:highlight w:val="yellow"/>
-              </w:rPr>
-            </w:pPr>
-            <w:r>
-              <w:rPr>
-                <w:highlight w:val="yellow"/>
-              </w:rPr>
-              <w:t xml:space="preserve">Hardcoded database, test with sequence to see if BLAST works </w:t>
-            </w:r>
+                <w:highlight w:val="darkGreen"/>
+              </w:rPr>
+            </w:pPr>
           </w:p>
         </w:tc>
       </w:tr>
@@ -3287,17 +3482,16 @@
               <w:bottom w:val="single" w:sz="4" w:space="0" w:color="auto"/>
               <w:right w:val="single" w:sz="4" w:space="0" w:color="auto"/>
             </w:tcBorders>
-            <w:hideMark/>
-          </w:tcPr>
-          <w:p>
-            <w:pPr>
-              <w:rPr>
-                <w:highlight w:val="yellow"/>
-              </w:rPr>
-            </w:pPr>
-            <w:r>
-              <w:rPr>
-                <w:highlight w:val="yellow"/>
+          </w:tcPr>
+          <w:p>
+            <w:pPr>
+              <w:rPr>
+                <w:highlight w:val="darkGreen"/>
+              </w:rPr>
+            </w:pPr>
+            <w:r>
+              <w:rPr>
+                <w:highlight w:val="darkGreen"/>
               </w:rPr>
               <w:t>Acceptance test (exact description):</w:t>
             </w:r>
@@ -3305,187 +3499,7 @@
           <w:p>
             <w:pPr>
               <w:rPr>
-                <w:highlight w:val="yellow"/>
-              </w:rPr>
-            </w:pPr>
-            <w:r>
-              <w:rPr>
-                <w:highlight w:val="yellow"/>
-              </w:rPr>
-              <w:t>...</w:t>
-            </w:r>
-          </w:p>
-        </w:tc>
-      </w:tr>
-    </w:tbl>
-    <w:p>
-      <w:pPr>
-        <w:rPr>
-          <w:b/>
-          <w:bCs/>
-          <w:highlight w:val="yellow"/>
-        </w:rPr>
-      </w:pPr>
-      <w:r>
-        <w:rPr>
-          <w:b/>
-          <w:bCs/>
-          <w:highlight w:val="yellow"/>
-        </w:rPr>
-        <w:t>Input field for sequence</w:t>
-      </w:r>
-    </w:p>
-    <w:tbl>
-      <w:tblPr>
-        <w:tblStyle w:val="TableGrid"/>
-        <w:tblW w:w="0" w:type="auto"/>
-        <w:tblLook w:val="04A0" w:firstRow="1" w:lastRow="0" w:firstColumn="1" w:lastColumn="0" w:noHBand="0" w:noVBand="1"/>
-      </w:tblPr>
-      <w:tblGrid>
-        <w:gridCol w:w="8299"/>
-      </w:tblGrid>
-      <w:tr>
-        <w:tc>
-          <w:tcPr>
-            <w:tcW w:w="8299" w:type="dxa"/>
-            <w:tcBorders>
-              <w:top w:val="single" w:sz="4" w:space="0" w:color="auto"/>
-              <w:left w:val="single" w:sz="4" w:space="0" w:color="auto"/>
-              <w:bottom w:val="single" w:sz="4" w:space="0" w:color="auto"/>
-              <w:right w:val="single" w:sz="4" w:space="0" w:color="auto"/>
-            </w:tcBorders>
-            <w:hideMark/>
-          </w:tcPr>
-          <w:p>
-            <w:pPr>
-              <w:rPr>
-                <w:highlight w:val="yellow"/>
-              </w:rPr>
-            </w:pPr>
-            <w:r>
-              <w:rPr>
-                <w:highlight w:val="yellow"/>
-              </w:rPr>
-              <w:t>As a Biologist</w:t>
-            </w:r>
-          </w:p>
-        </w:tc>
-      </w:tr>
-      <w:tr>
-        <w:tc>
-          <w:tcPr>
-            <w:tcW w:w="8299" w:type="dxa"/>
-            <w:tcBorders>
-              <w:top w:val="single" w:sz="4" w:space="0" w:color="auto"/>
-              <w:left w:val="single" w:sz="4" w:space="0" w:color="auto"/>
-              <w:bottom w:val="single" w:sz="4" w:space="0" w:color="auto"/>
-              <w:right w:val="single" w:sz="4" w:space="0" w:color="auto"/>
-            </w:tcBorders>
-            <w:hideMark/>
-          </w:tcPr>
-          <w:p>
-            <w:pPr>
-              <w:rPr>
-                <w:highlight w:val="yellow"/>
-              </w:rPr>
-            </w:pPr>
-            <w:r>
-              <w:rPr>
-                <w:highlight w:val="yellow"/>
-              </w:rPr>
-              <w:t>I want to have a test field to input my sequence</w:t>
-            </w:r>
-          </w:p>
-        </w:tc>
-      </w:tr>
-      <w:tr>
-        <w:tc>
-          <w:tcPr>
-            <w:tcW w:w="8299" w:type="dxa"/>
-            <w:tcBorders>
-              <w:top w:val="single" w:sz="4" w:space="0" w:color="auto"/>
-              <w:left w:val="single" w:sz="4" w:space="0" w:color="auto"/>
-              <w:bottom w:val="single" w:sz="4" w:space="0" w:color="auto"/>
-              <w:right w:val="single" w:sz="4" w:space="0" w:color="auto"/>
-            </w:tcBorders>
-            <w:hideMark/>
-          </w:tcPr>
-          <w:p>
-            <w:pPr>
-              <w:rPr>
-                <w:highlight w:val="yellow"/>
-              </w:rPr>
-            </w:pPr>
-            <w:r>
-              <w:rPr>
-                <w:highlight w:val="yellow"/>
-              </w:rPr>
-              <w:t>So that I can run BLAST on a sequence without having to add it to a BLAST file.</w:t>
-            </w:r>
-          </w:p>
-        </w:tc>
-      </w:tr>
-      <w:tr>
-        <w:tc>
-          <w:tcPr>
-            <w:tcW w:w="8299" w:type="dxa"/>
-            <w:tcBorders>
-              <w:top w:val="single" w:sz="4" w:space="0" w:color="auto"/>
-              <w:left w:val="single" w:sz="4" w:space="0" w:color="auto"/>
-              <w:bottom w:val="single" w:sz="4" w:space="0" w:color="auto"/>
-              <w:right w:val="single" w:sz="4" w:space="0" w:color="auto"/>
-            </w:tcBorders>
-          </w:tcPr>
-          <w:p>
-            <w:pPr>
-              <w:rPr>
-                <w:highlight w:val="yellow"/>
-              </w:rPr>
-            </w:pPr>
-            <w:r>
-              <w:rPr>
-                <w:highlight w:val="yellow"/>
-              </w:rPr>
-              <w:t>Acceptance criteria:</w:t>
-            </w:r>
-          </w:p>
-          <w:p>
-            <w:pPr>
-              <w:rPr>
-                <w:highlight w:val="yellow"/>
-              </w:rPr>
-            </w:pPr>
-          </w:p>
-        </w:tc>
-      </w:tr>
-      <w:tr>
-        <w:tc>
-          <w:tcPr>
-            <w:tcW w:w="8299" w:type="dxa"/>
-            <w:tcBorders>
-              <w:top w:val="single" w:sz="4" w:space="0" w:color="auto"/>
-              <w:left w:val="single" w:sz="4" w:space="0" w:color="auto"/>
-              <w:bottom w:val="single" w:sz="4" w:space="0" w:color="auto"/>
-              <w:right w:val="single" w:sz="4" w:space="0" w:color="auto"/>
-            </w:tcBorders>
-          </w:tcPr>
-          <w:p>
-            <w:pPr>
-              <w:rPr>
-                <w:highlight w:val="yellow"/>
-              </w:rPr>
-            </w:pPr>
-            <w:r>
-              <w:rPr>
-                <w:highlight w:val="yellow"/>
-              </w:rPr>
-              <w:t>Acceptance test (exact description):</w:t>
-            </w:r>
-          </w:p>
-          <w:p>
-            <w:pPr>
-              <w:rPr>
-                <w:highlight w:val="yellow"/>
+                <w:highlight w:val="darkGreen"/>
               </w:rPr>
             </w:pPr>
           </w:p>

</xml_diff>

<commit_message>
CA: changed some user stories to match more with the intention of what a user story should be used for
</commit_message>
<xml_diff>
--- a/BlastImplementation/documentation/Use case diagram/useCase_userStories/UserStories_21042026_final.docx
+++ b/BlastImplementation/documentation/Use case diagram/useCase_userStories/UserStories_21042026_final.docx
@@ -233,15 +233,7 @@
         </w:numPr>
       </w:pPr>
       <w:r>
-        <w:t>find all K-</w:t>
-      </w:r>
-      <w:proofErr w:type="spellStart"/>
-      <w:r>
-        <w:t>mers</w:t>
-      </w:r>
-      <w:proofErr w:type="spellEnd"/>
-      <w:r>
-        <w:t xml:space="preserve"> of a given length in a given DNA or protein sequence</w:t>
+        <w:t>find all K-mers of a given length in a given DNA or protein sequence</w:t>
       </w:r>
     </w:p>
     <w:p>
@@ -317,29 +309,13 @@
         <w:t>;</w:t>
       </w:r>
       <w:r>
-        <w:t xml:space="preserve"> the e-value threshold, the maximum number of output sequences (in case of many hits), and the scoring matrix that is used in the BLAST algorithm. The user wants to perform BLASTP using the default </w:t>
-      </w:r>
-      <w:proofErr w:type="spellStart"/>
-      <w:r>
-        <w:t>Uniprot</w:t>
-      </w:r>
-      <w:proofErr w:type="spellEnd"/>
-      <w:r>
-        <w:t xml:space="preserve"> database</w:t>
+        <w:t xml:space="preserve"> the e-value threshold, the maximum number of output sequences (in case of many hits), and the scoring matrix that is used in the BLAST algorithm. The user wants to perform BLASTP using the default Uniprot database</w:t>
       </w:r>
       <w:r>
         <w:t xml:space="preserve"> for proteins, or their own database when using BLASTN / BLASTP</w:t>
       </w:r>
       <w:r>
-        <w:t xml:space="preserve">. When the user provides its own database, the provided database needs to be used instead of the default </w:t>
-      </w:r>
-      <w:proofErr w:type="spellStart"/>
-      <w:r>
-        <w:t>Uniprot</w:t>
-      </w:r>
-      <w:proofErr w:type="spellEnd"/>
-      <w:r>
-        <w:t xml:space="preserve"> database</w:t>
+        <w:t>. When the user provides its own database, the provided database needs to be used instead of the default Uniprot database</w:t>
       </w:r>
       <w:r>
         <w:t xml:space="preserve"> in case of BLASTP</w:t>
@@ -360,15 +336,7 @@
         <w:t>stored in the downloads folder of the user and also be shown in a new output window. The output window needs to be the same</w:t>
       </w:r>
       <w:r>
-        <w:t xml:space="preserve">, whether the default </w:t>
-      </w:r>
-      <w:proofErr w:type="spellStart"/>
-      <w:r>
-        <w:t>Uniprot</w:t>
-      </w:r>
-      <w:proofErr w:type="spellEnd"/>
-      <w:r>
-        <w:t xml:space="preserve"> is used in BLASTP or the user gives their own database. </w:t>
+        <w:t xml:space="preserve">, whether the default Uniprot is used in BLASTP or the user gives their own database. </w:t>
       </w:r>
     </w:p>
     <w:p/>
@@ -870,13 +838,8 @@
             <w:r>
               <w:t xml:space="preserve">g the </w:t>
             </w:r>
-            <w:proofErr w:type="spellStart"/>
-            <w:r>
-              <w:t>gui</w:t>
-            </w:r>
-            <w:proofErr w:type="spellEnd"/>
-            <w:r>
-              <w:t xml:space="preserve"> shows after clicki</w:t>
+            <w:r>
+              <w:t>gui shows after clicki</w:t>
             </w:r>
             <w:r>
               <w:t>ng the but</w:t>
@@ -960,15 +923,7 @@
               <w:t>S</w:t>
             </w:r>
             <w:r>
-              <w:t xml:space="preserve">o that </w:t>
-            </w:r>
-            <w:proofErr w:type="spellStart"/>
-            <w:r>
-              <w:t>i</w:t>
-            </w:r>
-            <w:proofErr w:type="spellEnd"/>
-            <w:r>
-              <w:t xml:space="preserve"> know the search is running and the application has not frozen</w:t>
+              <w:t>o that i know the search is running and the application has not frozen</w:t>
             </w:r>
           </w:p>
         </w:tc>
@@ -1094,21 +1049,8 @@
             <w:r>
               <w:t xml:space="preserve">o that </w:t>
             </w:r>
-            <w:proofErr w:type="spellStart"/>
-            <w:r>
-              <w:t>i</w:t>
-            </w:r>
-            <w:proofErr w:type="spellEnd"/>
-            <w:r>
-              <w:t xml:space="preserve"> can save share and </w:t>
-            </w:r>
-            <w:proofErr w:type="spellStart"/>
-            <w:r>
-              <w:t>futher</w:t>
-            </w:r>
-            <w:proofErr w:type="spellEnd"/>
-            <w:r>
-              <w:t xml:space="preserve"> analyze my results outside of the application</w:t>
+            <w:r>
+              <w:t>i can save share and futher analyze my results outside of the application</w:t>
             </w:r>
           </w:p>
         </w:tc>
@@ -1224,15 +1166,7 @@
               <w:t>S</w:t>
             </w:r>
             <w:r>
-              <w:t xml:space="preserve">o that </w:t>
-            </w:r>
-            <w:proofErr w:type="spellStart"/>
-            <w:r>
-              <w:t>i</w:t>
-            </w:r>
-            <w:proofErr w:type="spellEnd"/>
-            <w:r>
-              <w:t xml:space="preserve"> </w:t>
+              <w:t xml:space="preserve">o that i </w:t>
             </w:r>
             <w:r>
               <w:t>can be guided toward the most appropriate next analysis step depending on my sequence type and properties</w:t>
@@ -1498,19 +1432,11 @@
               </w:rPr>
               <w:t xml:space="preserve">Having two </w:t>
             </w:r>
-            <w:proofErr w:type="spellStart"/>
             <w:r>
               <w:rPr>
                 <w:highlight w:val="green"/>
               </w:rPr>
-              <w:t>tsv</w:t>
-            </w:r>
-            <w:proofErr w:type="spellEnd"/>
-            <w:r>
-              <w:rPr>
-                <w:highlight w:val="green"/>
-              </w:rPr>
-              <w:t xml:space="preserve"> </w:t>
+              <w:t xml:space="preserve">tsv </w:t>
             </w:r>
             <w:r>
               <w:rPr>
@@ -2606,21 +2532,7 @@
         <w:rPr>
           <w:highlight w:val="lightGray"/>
         </w:rPr>
-        <w:t xml:space="preserve">BLASTP on default </w:t>
-      </w:r>
-      <w:proofErr w:type="spellStart"/>
-      <w:r>
-        <w:rPr>
-          <w:highlight w:val="lightGray"/>
-        </w:rPr>
-        <w:t>Uniprot</w:t>
-      </w:r>
-      <w:proofErr w:type="spellEnd"/>
-      <w:r>
-        <w:rPr>
-          <w:highlight w:val="lightGray"/>
-        </w:rPr>
-        <w:t xml:space="preserve"> database</w:t>
+        <w:t>BLASTP on default Uniprot database</w:t>
       </w:r>
     </w:p>
     <w:tbl>
@@ -2687,21 +2599,7 @@
               <w:rPr>
                 <w:highlight w:val="lightGray"/>
               </w:rPr>
-              <w:t xml:space="preserve">using the default </w:t>
-            </w:r>
-            <w:proofErr w:type="spellStart"/>
-            <w:r>
-              <w:rPr>
-                <w:highlight w:val="lightGray"/>
-              </w:rPr>
-              <w:t>Uniprot</w:t>
-            </w:r>
-            <w:proofErr w:type="spellEnd"/>
-            <w:r>
-              <w:rPr>
-                <w:highlight w:val="lightGray"/>
-              </w:rPr>
-              <w:t xml:space="preserve"> database after I entered either a protein sequence in FASTA format in the therefore intended text box or uploaded a FASTA file of a protein sequence. After entering the sequence</w:t>
+              <w:t>using the default Uniprot database after I entered either a protein sequence in FASTA format in the therefore intended text box or uploaded a FASTA file of a protein sequence. After entering the sequence</w:t>
             </w:r>
             <w:r>
               <w:rPr>
@@ -2886,105 +2784,77 @@
               <w:rPr>
                 <w:highlight w:val="lightGray"/>
               </w:rPr>
-              <w:t xml:space="preserve">run the BLASTP tool using my own custom database provided in FASTA format. As with the default </w:t>
-            </w:r>
-            <w:proofErr w:type="spellStart"/>
-            <w:r>
+              <w:t xml:space="preserve">run the BLASTP tool using my own custom database provided in FASTA format. As with the default Uniprot database, the query protein sequence can be provided in text box in FASTA format or uploaded as a FASTA file. When I press the BLAST button, the BLASTP should run using my custom database.  </w:t>
+            </w:r>
+          </w:p>
+        </w:tc>
+      </w:tr>
+      <w:tr>
+        <w:tc>
+          <w:tcPr>
+            <w:tcW w:w="8299" w:type="dxa"/>
+          </w:tcPr>
+          <w:p>
+            <w:pPr>
               <w:rPr>
                 <w:highlight w:val="lightGray"/>
               </w:rPr>
-              <w:t>Uniprot</w:t>
-            </w:r>
-            <w:proofErr w:type="spellEnd"/>
-            <w:r>
-              <w:rPr>
+            </w:pPr>
+            <w:r>
+              <w:rPr>
+                <w:b/>
+                <w:bCs/>
                 <w:highlight w:val="lightGray"/>
               </w:rPr>
-              <w:t xml:space="preserve"> database, the query protein sequence can be provided in text box in FASTA format or uploaded as a FASTA file. When I press the BLAST button, the BLASTP should run using my custom database.  </w:t>
-            </w:r>
-          </w:p>
-        </w:tc>
-      </w:tr>
-      <w:tr>
-        <w:tc>
-          <w:tcPr>
-            <w:tcW w:w="8299" w:type="dxa"/>
-          </w:tcPr>
-          <w:p>
-            <w:pPr>
+              <w:t>So that</w:t>
+            </w:r>
+            <w:r>
               <w:rPr>
                 <w:highlight w:val="lightGray"/>
               </w:rPr>
-            </w:pPr>
-            <w:r>
-              <w:rPr>
-                <w:b/>
-                <w:bCs/>
+              <w:t xml:space="preserve"> </w:t>
+            </w:r>
+            <w:r>
+              <w:rPr>
                 <w:highlight w:val="lightGray"/>
               </w:rPr>
-              <w:t>So that</w:t>
-            </w:r>
-            <w:r>
+              <w:t>I can analyze, using the BLASTP output, which proteins are similar to my query sequence and from what organism these proteins are.</w:t>
+            </w:r>
+          </w:p>
+        </w:tc>
+      </w:tr>
+      <w:tr>
+        <w:tc>
+          <w:tcPr>
+            <w:tcW w:w="8299" w:type="dxa"/>
+          </w:tcPr>
+          <w:p>
+            <w:pPr>
               <w:rPr>
                 <w:highlight w:val="lightGray"/>
               </w:rPr>
-              <w:t xml:space="preserve"> </w:t>
-            </w:r>
-            <w:r>
-              <w:rPr>
+            </w:pPr>
+            <w:r>
+              <w:rPr>
+                <w:b/>
+                <w:bCs/>
                 <w:highlight w:val="lightGray"/>
               </w:rPr>
-              <w:t>I can analyze, using the BLASTP output, which proteins are similar to my query sequence and from what organism these proteins are.</w:t>
-            </w:r>
-          </w:p>
-        </w:tc>
-      </w:tr>
-      <w:tr>
-        <w:tc>
-          <w:tcPr>
-            <w:tcW w:w="8299" w:type="dxa"/>
-          </w:tcPr>
-          <w:p>
-            <w:pPr>
+              <w:t>Acceptance criteria</w:t>
+            </w:r>
+            <w:r>
               <w:rPr>
                 <w:highlight w:val="lightGray"/>
               </w:rPr>
-            </w:pPr>
-            <w:r>
-              <w:rPr>
-                <w:b/>
-                <w:bCs/>
+              <w:t>:</w:t>
+            </w:r>
+          </w:p>
+          <w:p>
+            <w:r>
+              <w:rPr>
                 <w:highlight w:val="lightGray"/>
               </w:rPr>
-              <w:t>Acceptance criteria</w:t>
-            </w:r>
-            <w:r>
-              <w:rPr>
-                <w:highlight w:val="lightGray"/>
-              </w:rPr>
-              <w:t>:</w:t>
-            </w:r>
-          </w:p>
-          <w:p>
-            <w:r>
-              <w:rPr>
-                <w:highlight w:val="lightGray"/>
-              </w:rPr>
-              <w:t xml:space="preserve">After I put in either a protein sequence in FASTA format in the therefore intended text box or upload a FASTA file of a protein sequence and provide a custom database in FASTA format, the BLASTP output should be written to a file in my downloads folder and shown in a new window when I press the BLAST button. Importantly, it should not use the default </w:t>
-            </w:r>
-            <w:proofErr w:type="spellStart"/>
-            <w:r>
-              <w:rPr>
-                <w:highlight w:val="lightGray"/>
-              </w:rPr>
-              <w:t>Uniprot</w:t>
-            </w:r>
-            <w:proofErr w:type="spellEnd"/>
-            <w:r>
-              <w:rPr>
-                <w:highlight w:val="lightGray"/>
-              </w:rPr>
-              <w:t xml:space="preserve"> database when I provide my own database.</w:t>
+              <w:t>After I put in either a protein sequence in FASTA format in the therefore intended text box or upload a FASTA file of a protein sequence and provide a custom database in FASTA format, the BLASTP output should be written to a file in my downloads folder and shown in a new window when I press the BLAST button. Importantly, it should not use the default Uniprot database when I provide my own database.</w:t>
             </w:r>
           </w:p>
         </w:tc>
@@ -3072,17 +2942,8 @@
           <w:b/>
           <w:bCs/>
         </w:rPr>
-        <w:t xml:space="preserve">Group A: </w:t>
-      </w:r>
-      <w:proofErr w:type="spellStart"/>
-      <w:r>
-        <w:rPr>
-          <w:b/>
-          <w:bCs/>
-        </w:rPr>
-        <w:t>EzBLAST</w:t>
-      </w:r>
-      <w:proofErr w:type="spellEnd"/>
+        <w:t>Group A: EzBLAST</w:t>
+      </w:r>
     </w:p>
     <w:p>
       <w:pPr>
@@ -3113,15 +2974,7 @@
     </w:p>
     <w:p>
       <w:r>
-        <w:t xml:space="preserve">The user is a life science scientist and wants to analyze their data. In this instance, we limit the input data to a </w:t>
-      </w:r>
-      <w:proofErr w:type="spellStart"/>
-      <w:r>
-        <w:t>fasta</w:t>
-      </w:r>
-      <w:proofErr w:type="spellEnd"/>
-      <w:r>
-        <w:t xml:space="preserve"> sequence of an unknown organism. </w:t>
+        <w:t xml:space="preserve">The user is a life science scientist and wants to analyze their data. In this instance, we limit the input data to a fasta sequence of an unknown organism. </w:t>
       </w:r>
     </w:p>
     <w:p/>
@@ -3159,6 +3012,14 @@
           <w:highlight w:val="darkGreen"/>
         </w:rPr>
         <w:t>Upload database</w:t>
+      </w:r>
+      <w:r>
+        <w:rPr>
+          <w:b/>
+          <w:bCs/>
+          <w:highlight w:val="darkGreen"/>
+        </w:rPr>
+        <w:t xml:space="preserve"> for custom BLAST search</w:t>
       </w:r>
     </w:p>
     <w:tbl>
@@ -3192,7 +3053,13 @@
               <w:rPr>
                 <w:highlight w:val="darkGreen"/>
               </w:rPr>
-              <w:t>As a researcher</w:t>
+              <w:t xml:space="preserve">As a </w:t>
+            </w:r>
+            <w:r>
+              <w:rPr>
+                <w:highlight w:val="darkGreen"/>
+              </w:rPr>
+              <w:t>life science scientist</w:t>
             </w:r>
           </w:p>
         </w:tc>
@@ -3286,7 +3153,25 @@
               <w:rPr>
                 <w:highlight w:val="darkGreen"/>
               </w:rPr>
-              <w:t xml:space="preserve">Hardcoded database, test with sequence to see if BLAST works </w:t>
+              <w:t>Hardcoded database, test with sequence to see if BLAST works</w:t>
+            </w:r>
+            <w:r>
+              <w:rPr>
+                <w:highlight w:val="darkGreen"/>
+              </w:rPr>
+              <w:t xml:space="preserve">. When a sequence is provided that does not match any sequences in the provided database, no match should be found. However, if the </w:t>
+            </w:r>
+            <w:r>
+              <w:rPr>
+                <w:highlight w:val="darkGreen"/>
+              </w:rPr>
+              <w:t>provided sequence is very similar to the sequences in the database, a positive output should be returned.</w:t>
+            </w:r>
+            <w:r>
+              <w:rPr>
+                <w:highlight w:val="darkGreen"/>
+              </w:rPr>
+              <w:t xml:space="preserve"> </w:t>
             </w:r>
           </w:p>
         </w:tc>
@@ -3326,7 +3211,13 @@
               <w:rPr>
                 <w:highlight w:val="darkGreen"/>
               </w:rPr>
-              <w:t>...</w:t>
+              <w:t xml:space="preserve">The user opens the main GUI, navigates to BLAST and uploads their database and query sequence. The user runs BLAST and depending on whether the sequence matches the </w:t>
+            </w:r>
+            <w:r>
+              <w:rPr>
+                <w:highlight w:val="darkGreen"/>
+              </w:rPr>
+              <w:t>sequences in the database, an output is created with information about the matching sequences, or no useable output is formed.</w:t>
             </w:r>
           </w:p>
         </w:tc>
@@ -3340,13 +3231,46 @@
           <w:highlight w:val="darkGreen"/>
         </w:rPr>
       </w:pPr>
-      <w:r>
+    </w:p>
+    <w:p>
+      <w:pPr>
         <w:rPr>
           <w:b/>
           <w:bCs/>
           <w:highlight w:val="darkGreen"/>
         </w:rPr>
-        <w:t>Input field for sequence</w:t>
+      </w:pPr>
+      <w:r>
+        <w:rPr>
+          <w:b/>
+          <w:bCs/>
+          <w:highlight w:val="darkGreen"/>
+        </w:rPr>
+        <w:t>Create i</w:t>
+      </w:r>
+      <w:r>
+        <w:rPr>
+          <w:b/>
+          <w:bCs/>
+          <w:highlight w:val="darkGreen"/>
+        </w:rPr>
+        <w:t xml:space="preserve">nput </w:t>
+      </w:r>
+      <w:r>
+        <w:rPr>
+          <w:b/>
+          <w:bCs/>
+          <w:highlight w:val="darkGreen"/>
+        </w:rPr>
+        <w:t xml:space="preserve">text </w:t>
+      </w:r>
+      <w:r>
+        <w:rPr>
+          <w:b/>
+          <w:bCs/>
+          <w:highlight w:val="darkGreen"/>
+        </w:rPr>
+        <w:t>field for sequence</w:t>
       </w:r>
     </w:p>
     <w:tbl>
@@ -3380,7 +3304,13 @@
               <w:rPr>
                 <w:highlight w:val="darkGreen"/>
               </w:rPr>
-              <w:t>As a Biologist</w:t>
+              <w:t xml:space="preserve">As a </w:t>
+            </w:r>
+            <w:r>
+              <w:rPr>
+                <w:highlight w:val="darkGreen"/>
+              </w:rPr>
+              <w:t>life science scientist</w:t>
             </w:r>
           </w:p>
         </w:tc>
@@ -3407,7 +3337,19 @@
               <w:rPr>
                 <w:highlight w:val="darkGreen"/>
               </w:rPr>
-              <w:t>I want to have a test field to input my sequence</w:t>
+              <w:t>I want to have a te</w:t>
+            </w:r>
+            <w:r>
+              <w:rPr>
+                <w:highlight w:val="darkGreen"/>
+              </w:rPr>
+              <w:t>x</w:t>
+            </w:r>
+            <w:r>
+              <w:rPr>
+                <w:highlight w:val="darkGreen"/>
+              </w:rPr>
+              <w:t>t field to input my sequence</w:t>
             </w:r>
           </w:p>
         </w:tc>
@@ -3434,7 +3376,19 @@
               <w:rPr>
                 <w:highlight w:val="darkGreen"/>
               </w:rPr>
-              <w:t>So that I can run BLAST on a sequence without having to add it to a BLAST file.</w:t>
+              <w:t>So that I can run BLAST on a sequence without having to add it to a BLAST file</w:t>
+            </w:r>
+            <w:r>
+              <w:rPr>
+                <w:highlight w:val="darkGreen"/>
+              </w:rPr>
+              <w:t xml:space="preserve"> first</w:t>
+            </w:r>
+            <w:r>
+              <w:rPr>
+                <w:highlight w:val="darkGreen"/>
+              </w:rPr>
+              <w:t>.</w:t>
             </w:r>
           </w:p>
         </w:tc>
@@ -3469,6 +3423,25 @@
                 <w:highlight w:val="darkGreen"/>
               </w:rPr>
             </w:pPr>
+            <w:r>
+              <w:rPr>
+                <w:highlight w:val="darkGreen"/>
+              </w:rPr>
+              <w:t xml:space="preserve">Writing </w:t>
+            </w:r>
+            <w:r>
+              <w:rPr>
+                <w:highlight w:val="darkGreen"/>
+              </w:rPr>
+              <w:t>a sequence in the text field is accepted by the BLAST algorithm and a successful output is created</w:t>
+            </w:r>
+          </w:p>
+          <w:p>
+            <w:pPr>
+              <w:rPr>
+                <w:highlight w:val="darkGreen"/>
+              </w:rPr>
+            </w:pPr>
           </w:p>
         </w:tc>
       </w:tr>
@@ -3502,10 +3475,36 @@
                 <w:highlight w:val="darkGreen"/>
               </w:rPr>
             </w:pPr>
+            <w:r>
+              <w:rPr>
+                <w:highlight w:val="darkGreen"/>
+              </w:rPr>
+              <w:t xml:space="preserve">The user navigates from the main GUI to the BLAST tool and </w:t>
+            </w:r>
+            <w:r>
+              <w:rPr>
+                <w:highlight w:val="darkGreen"/>
+              </w:rPr>
+              <w:t xml:space="preserve">writes a sequence in the text field. The user than runs the BLAST tool and creates an output. </w:t>
+            </w:r>
+          </w:p>
+          <w:p>
+            <w:pPr>
+              <w:rPr>
+                <w:highlight w:val="darkGreen"/>
+              </w:rPr>
+            </w:pPr>
           </w:p>
         </w:tc>
       </w:tr>
     </w:tbl>
+    <w:p>
+      <w:pPr>
+        <w:rPr>
+          <w:highlight w:val="yellow"/>
+        </w:rPr>
+      </w:pPr>
+    </w:p>
     <w:p>
       <w:pPr>
         <w:rPr>
@@ -3514,22 +3513,37 @@
           <w:highlight w:val="yellow"/>
         </w:rPr>
       </w:pPr>
-    </w:p>
-    <w:p>
-      <w:pPr>
+      <w:r>
         <w:rPr>
           <w:b/>
           <w:bCs/>
           <w:highlight w:val="yellow"/>
         </w:rPr>
-      </w:pPr>
+        <w:t xml:space="preserve">Easy </w:t>
+      </w:r>
       <w:r>
         <w:rPr>
           <w:b/>
           <w:bCs/>
           <w:highlight w:val="yellow"/>
         </w:rPr>
-        <w:t>Easy BLAST</w:t>
+        <w:t>G</w:t>
+      </w:r>
+      <w:r>
+        <w:rPr>
+          <w:b/>
+          <w:bCs/>
+          <w:highlight w:val="yellow"/>
+        </w:rPr>
+        <w:t>UI design</w:t>
+      </w:r>
+      <w:r>
+        <w:rPr>
+          <w:b/>
+          <w:bCs/>
+          <w:highlight w:val="yellow"/>
+        </w:rPr>
+        <w:t xml:space="preserve"> for sequence analysis</w:t>
       </w:r>
     </w:p>
     <w:tbl>
@@ -3563,7 +3577,7 @@
               <w:rPr>
                 <w:highlight w:val="yellow"/>
               </w:rPr>
-              <w:t>As a life science scientist</w:t>
+              <w:t>As a student / researcher</w:t>
             </w:r>
           </w:p>
         </w:tc>
@@ -3590,7 +3604,13 @@
               <w:rPr>
                 <w:highlight w:val="yellow"/>
               </w:rPr>
-              <w:t>I want to simplify my use of BLAST for both protein and DNA searches.</w:t>
+              <w:t>I want to have a simple tool that is easy to understand a</w:t>
+            </w:r>
+            <w:r>
+              <w:rPr>
+                <w:highlight w:val="yellow"/>
+              </w:rPr>
+              <w:t>nd to interact with</w:t>
             </w:r>
           </w:p>
         </w:tc>
@@ -3617,7 +3637,7 @@
               <w:rPr>
                 <w:highlight w:val="yellow"/>
               </w:rPr>
-              <w:t>So that confusing but important choices are made for me as well as a general analysis of results with recommendations for further research ideas.</w:t>
+              <w:t>So that use case of the tool is clear in my mind</w:t>
             </w:r>
           </w:p>
         </w:tc>
@@ -3657,20 +3677,19 @@
               <w:rPr>
                 <w:highlight w:val="yellow"/>
               </w:rPr>
-              <w:t>I need any input, simplified settings, better understandable interface with tutorial for 1</w:t>
+              <w:t xml:space="preserve">There should be no obvious bugs when using the software, navigating through the software is intuitive and </w:t>
             </w:r>
             <w:r>
               <w:rPr>
                 <w:highlight w:val="yellow"/>
-                <w:vertAlign w:val="superscript"/>
-              </w:rPr>
-              <w:t>st</w:t>
+              </w:rPr>
+              <w:t xml:space="preserve">the tools and screens have logical names. The program does what the user expects that part of the program to do. </w:t>
             </w:r>
             <w:r>
               <w:rPr>
                 <w:highlight w:val="yellow"/>
               </w:rPr>
-              <w:t xml:space="preserve"> time use, downloadable and interactable output. </w:t>
+              <w:t xml:space="preserve"> </w:t>
             </w:r>
           </w:p>
         </w:tc>
@@ -3705,6 +3724,25 @@
                 <w:highlight w:val="yellow"/>
               </w:rPr>
             </w:pPr>
+            <w:r>
+              <w:rPr>
+                <w:highlight w:val="yellow"/>
+              </w:rPr>
+              <w:t>The user can roam through the software and try out many options, without creating bug, and can find help along the way at every step during the process</w:t>
+            </w:r>
+            <w:r>
+              <w:rPr>
+                <w:highlight w:val="yellow"/>
+              </w:rPr>
+              <w:t>.</w:t>
+            </w:r>
+          </w:p>
+          <w:p>
+            <w:pPr>
+              <w:rPr>
+                <w:highlight w:val="yellow"/>
+              </w:rPr>
+            </w:pPr>
           </w:p>
         </w:tc>
       </w:tr>
@@ -3724,13 +3762,23 @@
           <w:highlight w:val="yellow"/>
         </w:rPr>
       </w:pPr>
-      <w:r>
+    </w:p>
+    <w:p>
+      <w:pPr>
         <w:rPr>
           <w:b/>
           <w:bCs/>
           <w:highlight w:val="yellow"/>
         </w:rPr>
-        <w:t>Easy UI design</w:t>
+      </w:pPr>
+      <w:r>
+        <w:rPr>
+          <w:b/>
+          <w:bCs/>
+          <w:highlight w:val="yellow"/>
+        </w:rPr>
+        <w:lastRenderedPageBreak/>
+        <w:t>BLAST output to file</w:t>
       </w:r>
     </w:p>
     <w:tbl>
@@ -3764,7 +3812,7 @@
               <w:rPr>
                 <w:highlight w:val="yellow"/>
               </w:rPr>
-              <w:t>As a student / researcher</w:t>
+              <w:t>As a life science scientist</w:t>
             </w:r>
           </w:p>
         </w:tc>
@@ -3791,7 +3839,19 @@
               <w:rPr>
                 <w:highlight w:val="yellow"/>
               </w:rPr>
-              <w:t>I want to have a simple tool that is easy to understand and be more interactive with user.</w:t>
+              <w:t xml:space="preserve">I want to be able to run a </w:t>
+            </w:r>
+            <w:r>
+              <w:rPr>
+                <w:highlight w:val="yellow"/>
+              </w:rPr>
+              <w:t>BLAST</w:t>
+            </w:r>
+            <w:r>
+              <w:rPr>
+                <w:highlight w:val="yellow"/>
+              </w:rPr>
+              <w:t xml:space="preserve"> tool that saves the output of my best matches to a file.</w:t>
             </w:r>
           </w:p>
         </w:tc>
@@ -3818,7 +3878,19 @@
               <w:rPr>
                 <w:highlight w:val="yellow"/>
               </w:rPr>
-              <w:t>So that use case of the tool is clear in my mind</w:t>
+              <w:t xml:space="preserve">So that I can at a later point look back at my </w:t>
+            </w:r>
+            <w:r>
+              <w:rPr>
+                <w:highlight w:val="yellow"/>
+              </w:rPr>
+              <w:t>BLAST</w:t>
+            </w:r>
+            <w:r>
+              <w:rPr>
+                <w:highlight w:val="yellow"/>
+              </w:rPr>
+              <w:t xml:space="preserve"> results without running the computational expensive algorithm again. </w:t>
             </w:r>
           </w:p>
         </w:tc>
@@ -3858,7 +3930,31 @@
               <w:rPr>
                 <w:highlight w:val="yellow"/>
               </w:rPr>
-              <w:t xml:space="preserve">I should feel using this software rather than a headache in my laptop </w:t>
+              <w:t>File</w:t>
+            </w:r>
+            <w:r>
+              <w:rPr>
+                <w:highlight w:val="yellow"/>
+              </w:rPr>
+              <w:t xml:space="preserve"> with </w:t>
+            </w:r>
+            <w:r>
+              <w:rPr>
+                <w:highlight w:val="yellow"/>
+              </w:rPr>
+              <w:t>BLASTP</w:t>
+            </w:r>
+            <w:r>
+              <w:rPr>
+                <w:highlight w:val="yellow"/>
+              </w:rPr>
+              <w:t xml:space="preserve"> output is created and saved in </w:t>
+            </w:r>
+            <w:r>
+              <w:rPr>
+                <w:highlight w:val="yellow"/>
+              </w:rPr>
+              <w:t>a folder specified by the user.</w:t>
             </w:r>
           </w:p>
         </w:tc>
@@ -3897,15 +3993,8 @@
               <w:rPr>
                 <w:highlight w:val="yellow"/>
               </w:rPr>
-              <w:t>A college student or a researcher can easily navigate in software without frustration, very easy for them to use.</w:t>
-            </w:r>
-          </w:p>
-          <w:p>
-            <w:pPr>
-              <w:rPr>
-                <w:highlight w:val="yellow"/>
-              </w:rPr>
-            </w:pPr>
+              <w:t xml:space="preserve">The user navigates from the main GUI to the BLAST tool, runs the tool using their query sequence and visualizes their output. The user then saves the file by manually choosing a folder and file name. The output is saved and can be opened by the user at any time. </w:t>
+            </w:r>
           </w:p>
         </w:tc>
       </w:tr>
@@ -3931,7 +4020,7 @@
           <w:bCs/>
           <w:highlight w:val="yellow"/>
         </w:rPr>
-        <w:t>Statistics for sequence</w:t>
+        <w:t>Upload fasta file</w:t>
       </w:r>
     </w:p>
     <w:tbl>
@@ -3965,7 +4054,13 @@
               <w:rPr>
                 <w:highlight w:val="yellow"/>
               </w:rPr>
-              <w:t>As a …</w:t>
+              <w:t xml:space="preserve">As a </w:t>
+            </w:r>
+            <w:r>
+              <w:rPr>
+                <w:highlight w:val="yellow"/>
+              </w:rPr>
+              <w:t>life science scientist</w:t>
             </w:r>
           </w:p>
         </w:tc>
@@ -3992,22 +4087,13 @@
               <w:rPr>
                 <w:highlight w:val="yellow"/>
               </w:rPr>
-              <w:lastRenderedPageBreak/>
-              <w:t>I want to have some important statistics for my sequence be displayed, examples: CG%, Tm ( for primers ) , reverse sequence, condiment, self-</w:t>
-            </w:r>
-            <w:proofErr w:type="spellStart"/>
+              <w:t>I want to upload a sequence</w:t>
+            </w:r>
             <w:r>
               <w:rPr>
                 <w:highlight w:val="yellow"/>
               </w:rPr>
-              <w:t>anealing</w:t>
-            </w:r>
-            <w:proofErr w:type="spellEnd"/>
-            <w:r>
-              <w:rPr>
-                <w:highlight w:val="yellow"/>
-              </w:rPr>
-              <w:t>, molecule weigh.</w:t>
+              <w:t xml:space="preserve"> by uploading a file.</w:t>
             </w:r>
           </w:p>
         </w:tc>
@@ -4034,7 +4120,7 @@
               <w:rPr>
                 <w:highlight w:val="yellow"/>
               </w:rPr>
-              <w:t xml:space="preserve">So that makes it easy for user to quickly have the input info about sequence so user can make informed decisions. </w:t>
+              <w:t>So that the sequence file can be inserted into the BLAST command. Name of the file is displayed after uploading. If not accepted display the message ‘ file is not a fasta file’</w:t>
             </w:r>
           </w:p>
         </w:tc>
@@ -4074,7 +4160,7 @@
               <w:rPr>
                 <w:highlight w:val="yellow"/>
               </w:rPr>
-              <w:t xml:space="preserve">Needs to accurately and display statistics. </w:t>
+              <w:t xml:space="preserve">Has to be a fasta file. A fasta at the end of the file name. Sequence begins with  &gt;  </w:t>
             </w:r>
           </w:p>
         </w:tc>
@@ -4109,17 +4195,16 @@
                 <w:highlight w:val="yellow"/>
               </w:rPr>
             </w:pPr>
+            <w:r>
+              <w:rPr>
+                <w:highlight w:val="yellow"/>
+              </w:rPr>
+              <w:t>The user navigates from the main GUI to the BLAST tool and presses the upload file button. A file explorer opens up and the user selects their file. T</w:t>
+            </w:r>
           </w:p>
         </w:tc>
       </w:tr>
     </w:tbl>
-    <w:p>
-      <w:pPr>
-        <w:rPr>
-          <w:highlight w:val="yellow"/>
-        </w:rPr>
-      </w:pPr>
-    </w:p>
     <w:p>
       <w:pPr>
         <w:rPr>
@@ -4128,699 +4213,7 @@
           <w:highlight w:val="yellow"/>
         </w:rPr>
       </w:pPr>
-      <w:r>
-        <w:rPr>
-          <w:b/>
-          <w:bCs/>
-          <w:highlight w:val="yellow"/>
-        </w:rPr>
-        <w:t>BLASTP output to file</w:t>
-      </w:r>
-    </w:p>
-    <w:tbl>
-      <w:tblPr>
-        <w:tblStyle w:val="TableGrid"/>
-        <w:tblW w:w="0" w:type="auto"/>
-        <w:tblLook w:val="04A0" w:firstRow="1" w:lastRow="0" w:firstColumn="1" w:lastColumn="0" w:noHBand="0" w:noVBand="1"/>
-      </w:tblPr>
-      <w:tblGrid>
-        <w:gridCol w:w="8299"/>
-      </w:tblGrid>
-      <w:tr>
-        <w:tc>
-          <w:tcPr>
-            <w:tcW w:w="8299" w:type="dxa"/>
-            <w:tcBorders>
-              <w:top w:val="single" w:sz="4" w:space="0" w:color="auto"/>
-              <w:left w:val="single" w:sz="4" w:space="0" w:color="auto"/>
-              <w:bottom w:val="single" w:sz="4" w:space="0" w:color="auto"/>
-              <w:right w:val="single" w:sz="4" w:space="0" w:color="auto"/>
-            </w:tcBorders>
-            <w:hideMark/>
-          </w:tcPr>
-          <w:p>
-            <w:pPr>
-              <w:rPr>
-                <w:highlight w:val="yellow"/>
-              </w:rPr>
-            </w:pPr>
-            <w:r>
-              <w:rPr>
-                <w:highlight w:val="yellow"/>
-              </w:rPr>
-              <w:t>As a life science scientist</w:t>
-            </w:r>
-          </w:p>
-        </w:tc>
-      </w:tr>
-      <w:tr>
-        <w:tc>
-          <w:tcPr>
-            <w:tcW w:w="8299" w:type="dxa"/>
-            <w:tcBorders>
-              <w:top w:val="single" w:sz="4" w:space="0" w:color="auto"/>
-              <w:left w:val="single" w:sz="4" w:space="0" w:color="auto"/>
-              <w:bottom w:val="single" w:sz="4" w:space="0" w:color="auto"/>
-              <w:right w:val="single" w:sz="4" w:space="0" w:color="auto"/>
-            </w:tcBorders>
-            <w:hideMark/>
-          </w:tcPr>
-          <w:p>
-            <w:pPr>
-              <w:rPr>
-                <w:highlight w:val="yellow"/>
-              </w:rPr>
-            </w:pPr>
-            <w:r>
-              <w:rPr>
-                <w:highlight w:val="yellow"/>
-              </w:rPr>
-              <w:t xml:space="preserve">I want to be able to run a </w:t>
-            </w:r>
-            <w:proofErr w:type="spellStart"/>
-            <w:r>
-              <w:rPr>
-                <w:highlight w:val="yellow"/>
-              </w:rPr>
-              <w:t>blastp</w:t>
-            </w:r>
-            <w:proofErr w:type="spellEnd"/>
-            <w:r>
-              <w:rPr>
-                <w:highlight w:val="yellow"/>
-              </w:rPr>
-              <w:t xml:space="preserve"> tool that saves the output of my best matches to a </w:t>
-            </w:r>
-            <w:proofErr w:type="spellStart"/>
-            <w:r>
-              <w:rPr>
-                <w:highlight w:val="yellow"/>
-              </w:rPr>
-              <w:t>fastafile</w:t>
-            </w:r>
-            <w:proofErr w:type="spellEnd"/>
-            <w:r>
-              <w:rPr>
-                <w:highlight w:val="yellow"/>
-              </w:rPr>
-              <w:t>.</w:t>
-            </w:r>
-          </w:p>
-        </w:tc>
-      </w:tr>
-      <w:tr>
-        <w:tc>
-          <w:tcPr>
-            <w:tcW w:w="8299" w:type="dxa"/>
-            <w:tcBorders>
-              <w:top w:val="single" w:sz="4" w:space="0" w:color="auto"/>
-              <w:left w:val="single" w:sz="4" w:space="0" w:color="auto"/>
-              <w:bottom w:val="single" w:sz="4" w:space="0" w:color="auto"/>
-              <w:right w:val="single" w:sz="4" w:space="0" w:color="auto"/>
-            </w:tcBorders>
-            <w:hideMark/>
-          </w:tcPr>
-          <w:p>
-            <w:pPr>
-              <w:rPr>
-                <w:highlight w:val="yellow"/>
-              </w:rPr>
-            </w:pPr>
-            <w:r>
-              <w:rPr>
-                <w:highlight w:val="yellow"/>
-              </w:rPr>
-              <w:t xml:space="preserve">So that I can at a later point look back at my </w:t>
-            </w:r>
-            <w:proofErr w:type="spellStart"/>
-            <w:r>
-              <w:rPr>
-                <w:highlight w:val="yellow"/>
-              </w:rPr>
-              <w:t>blastp</w:t>
-            </w:r>
-            <w:proofErr w:type="spellEnd"/>
-            <w:r>
-              <w:rPr>
-                <w:highlight w:val="yellow"/>
-              </w:rPr>
-              <w:t xml:space="preserve"> results without running the computational expensive algorithm again. </w:t>
-            </w:r>
-          </w:p>
-        </w:tc>
-      </w:tr>
-      <w:tr>
-        <w:tc>
-          <w:tcPr>
-            <w:tcW w:w="8299" w:type="dxa"/>
-            <w:tcBorders>
-              <w:top w:val="single" w:sz="4" w:space="0" w:color="auto"/>
-              <w:left w:val="single" w:sz="4" w:space="0" w:color="auto"/>
-              <w:bottom w:val="single" w:sz="4" w:space="0" w:color="auto"/>
-              <w:right w:val="single" w:sz="4" w:space="0" w:color="auto"/>
-            </w:tcBorders>
-            <w:hideMark/>
-          </w:tcPr>
-          <w:p>
-            <w:pPr>
-              <w:rPr>
-                <w:highlight w:val="yellow"/>
-              </w:rPr>
-            </w:pPr>
-            <w:r>
-              <w:rPr>
-                <w:highlight w:val="yellow"/>
-              </w:rPr>
-              <w:t>Acceptance criteria:</w:t>
-            </w:r>
-          </w:p>
-          <w:p>
-            <w:pPr>
-              <w:rPr>
-                <w:highlight w:val="yellow"/>
-              </w:rPr>
-            </w:pPr>
-            <w:proofErr w:type="spellStart"/>
-            <w:r>
-              <w:rPr>
-                <w:highlight w:val="yellow"/>
-              </w:rPr>
-              <w:t>Fastafile</w:t>
-            </w:r>
-            <w:proofErr w:type="spellEnd"/>
-            <w:r>
-              <w:rPr>
-                <w:highlight w:val="yellow"/>
-              </w:rPr>
-              <w:t xml:space="preserve"> with </w:t>
-            </w:r>
-            <w:proofErr w:type="spellStart"/>
-            <w:r>
-              <w:rPr>
-                <w:highlight w:val="yellow"/>
-              </w:rPr>
-              <w:t>blastp</w:t>
-            </w:r>
-            <w:proofErr w:type="spellEnd"/>
-            <w:r>
-              <w:rPr>
-                <w:highlight w:val="yellow"/>
-              </w:rPr>
-              <w:t xml:space="preserve">  output is created and saved in a place that is to be determined after </w:t>
-            </w:r>
-            <w:proofErr w:type="spellStart"/>
-            <w:r>
-              <w:rPr>
-                <w:highlight w:val="yellow"/>
-              </w:rPr>
-              <w:t>blastp</w:t>
-            </w:r>
-            <w:proofErr w:type="spellEnd"/>
-            <w:r>
-              <w:rPr>
-                <w:highlight w:val="yellow"/>
-              </w:rPr>
-              <w:t xml:space="preserve"> is run.  </w:t>
-            </w:r>
-          </w:p>
-        </w:tc>
-      </w:tr>
-      <w:tr>
-        <w:tc>
-          <w:tcPr>
-            <w:tcW w:w="8299" w:type="dxa"/>
-            <w:tcBorders>
-              <w:top w:val="single" w:sz="4" w:space="0" w:color="auto"/>
-              <w:left w:val="single" w:sz="4" w:space="0" w:color="auto"/>
-              <w:bottom w:val="single" w:sz="4" w:space="0" w:color="auto"/>
-              <w:right w:val="single" w:sz="4" w:space="0" w:color="auto"/>
-            </w:tcBorders>
-          </w:tcPr>
-          <w:p>
-            <w:pPr>
-              <w:rPr>
-                <w:highlight w:val="yellow"/>
-              </w:rPr>
-            </w:pPr>
-            <w:r>
-              <w:rPr>
-                <w:highlight w:val="yellow"/>
-              </w:rPr>
-              <w:t>Acceptance test (exact description):</w:t>
-            </w:r>
-          </w:p>
-          <w:p>
-            <w:pPr>
-              <w:rPr>
-                <w:highlight w:val="yellow"/>
-              </w:rPr>
-            </w:pPr>
-          </w:p>
-        </w:tc>
-      </w:tr>
-    </w:tbl>
-    <w:p>
-      <w:pPr>
-        <w:rPr>
-          <w:highlight w:val="yellow"/>
-        </w:rPr>
-      </w:pPr>
-    </w:p>
-    <w:p>
-      <w:pPr>
-        <w:rPr>
-          <w:b/>
-          <w:bCs/>
-          <w:highlight w:val="yellow"/>
-        </w:rPr>
-      </w:pPr>
-      <w:r>
-        <w:rPr>
-          <w:b/>
-          <w:bCs/>
-          <w:highlight w:val="yellow"/>
-        </w:rPr>
-        <w:t xml:space="preserve">Upload </w:t>
-      </w:r>
-      <w:proofErr w:type="spellStart"/>
-      <w:r>
-        <w:rPr>
-          <w:b/>
-          <w:bCs/>
-          <w:highlight w:val="yellow"/>
-        </w:rPr>
-        <w:t>fasta</w:t>
-      </w:r>
-      <w:proofErr w:type="spellEnd"/>
-      <w:r>
-        <w:rPr>
-          <w:b/>
-          <w:bCs/>
-          <w:highlight w:val="yellow"/>
-        </w:rPr>
-        <w:t xml:space="preserve"> file</w:t>
-      </w:r>
-    </w:p>
-    <w:tbl>
-      <w:tblPr>
-        <w:tblStyle w:val="TableGrid"/>
-        <w:tblW w:w="0" w:type="auto"/>
-        <w:tblLook w:val="04A0" w:firstRow="1" w:lastRow="0" w:firstColumn="1" w:lastColumn="0" w:noHBand="0" w:noVBand="1"/>
-      </w:tblPr>
-      <w:tblGrid>
-        <w:gridCol w:w="8299"/>
-      </w:tblGrid>
-      <w:tr>
-        <w:tc>
-          <w:tcPr>
-            <w:tcW w:w="8299" w:type="dxa"/>
-            <w:tcBorders>
-              <w:top w:val="single" w:sz="4" w:space="0" w:color="auto"/>
-              <w:left w:val="single" w:sz="4" w:space="0" w:color="auto"/>
-              <w:bottom w:val="single" w:sz="4" w:space="0" w:color="auto"/>
-              <w:right w:val="single" w:sz="4" w:space="0" w:color="auto"/>
-            </w:tcBorders>
-            <w:hideMark/>
-          </w:tcPr>
-          <w:p>
-            <w:pPr>
-              <w:rPr>
-                <w:highlight w:val="yellow"/>
-              </w:rPr>
-            </w:pPr>
-            <w:r>
-              <w:rPr>
-                <w:highlight w:val="yellow"/>
-              </w:rPr>
-              <w:t>As a biologist</w:t>
-            </w:r>
-          </w:p>
-        </w:tc>
-      </w:tr>
-      <w:tr>
-        <w:tc>
-          <w:tcPr>
-            <w:tcW w:w="8299" w:type="dxa"/>
-            <w:tcBorders>
-              <w:top w:val="single" w:sz="4" w:space="0" w:color="auto"/>
-              <w:left w:val="single" w:sz="4" w:space="0" w:color="auto"/>
-              <w:bottom w:val="single" w:sz="4" w:space="0" w:color="auto"/>
-              <w:right w:val="single" w:sz="4" w:space="0" w:color="auto"/>
-            </w:tcBorders>
-            <w:hideMark/>
-          </w:tcPr>
-          <w:p>
-            <w:pPr>
-              <w:rPr>
-                <w:highlight w:val="yellow"/>
-              </w:rPr>
-            </w:pPr>
-            <w:r>
-              <w:rPr>
-                <w:highlight w:val="yellow"/>
-              </w:rPr>
-              <w:t>I want to upload a sequence</w:t>
-            </w:r>
-          </w:p>
-        </w:tc>
-      </w:tr>
-      <w:tr>
-        <w:tc>
-          <w:tcPr>
-            <w:tcW w:w="8299" w:type="dxa"/>
-            <w:tcBorders>
-              <w:top w:val="single" w:sz="4" w:space="0" w:color="auto"/>
-              <w:left w:val="single" w:sz="4" w:space="0" w:color="auto"/>
-              <w:bottom w:val="single" w:sz="4" w:space="0" w:color="auto"/>
-              <w:right w:val="single" w:sz="4" w:space="0" w:color="auto"/>
-            </w:tcBorders>
-            <w:hideMark/>
-          </w:tcPr>
-          <w:p>
-            <w:pPr>
-              <w:rPr>
-                <w:highlight w:val="yellow"/>
-              </w:rPr>
-            </w:pPr>
-            <w:r>
-              <w:rPr>
-                <w:highlight w:val="yellow"/>
-              </w:rPr>
-              <w:t xml:space="preserve">So that the sequence file can be inserted into the BLAST command. Name of the file is displayed after uploading. If not accepted display the message ‘ file is not a </w:t>
-            </w:r>
-            <w:proofErr w:type="spellStart"/>
-            <w:r>
-              <w:rPr>
-                <w:highlight w:val="yellow"/>
-              </w:rPr>
-              <w:t>fasta</w:t>
-            </w:r>
-            <w:proofErr w:type="spellEnd"/>
-            <w:r>
-              <w:rPr>
-                <w:highlight w:val="yellow"/>
-              </w:rPr>
-              <w:t xml:space="preserve"> file’</w:t>
-            </w:r>
-          </w:p>
-        </w:tc>
-      </w:tr>
-      <w:tr>
-        <w:tc>
-          <w:tcPr>
-            <w:tcW w:w="8299" w:type="dxa"/>
-            <w:tcBorders>
-              <w:top w:val="single" w:sz="4" w:space="0" w:color="auto"/>
-              <w:left w:val="single" w:sz="4" w:space="0" w:color="auto"/>
-              <w:bottom w:val="single" w:sz="4" w:space="0" w:color="auto"/>
-              <w:right w:val="single" w:sz="4" w:space="0" w:color="auto"/>
-            </w:tcBorders>
-            <w:hideMark/>
-          </w:tcPr>
-          <w:p>
-            <w:pPr>
-              <w:rPr>
-                <w:highlight w:val="yellow"/>
-              </w:rPr>
-            </w:pPr>
-            <w:r>
-              <w:rPr>
-                <w:highlight w:val="yellow"/>
-              </w:rPr>
-              <w:t>Acceptance criteria:</w:t>
-            </w:r>
-          </w:p>
-          <w:p>
-            <w:pPr>
-              <w:rPr>
-                <w:highlight w:val="yellow"/>
-              </w:rPr>
-            </w:pPr>
-            <w:r>
-              <w:rPr>
-                <w:highlight w:val="yellow"/>
-              </w:rPr>
-              <w:t xml:space="preserve">Has to be a </w:t>
-            </w:r>
-            <w:proofErr w:type="spellStart"/>
-            <w:r>
-              <w:rPr>
-                <w:highlight w:val="yellow"/>
-              </w:rPr>
-              <w:t>fasta</w:t>
-            </w:r>
-            <w:proofErr w:type="spellEnd"/>
-            <w:r>
-              <w:rPr>
-                <w:highlight w:val="yellow"/>
-              </w:rPr>
-              <w:t xml:space="preserve"> file. A </w:t>
-            </w:r>
-            <w:proofErr w:type="spellStart"/>
-            <w:r>
-              <w:rPr>
-                <w:highlight w:val="yellow"/>
-              </w:rPr>
-              <w:t>fasta</w:t>
-            </w:r>
-            <w:proofErr w:type="spellEnd"/>
-            <w:r>
-              <w:rPr>
-                <w:highlight w:val="yellow"/>
-              </w:rPr>
-              <w:t xml:space="preserve"> at the end of the file name. Sequence begins with  &gt;  </w:t>
-            </w:r>
-          </w:p>
-        </w:tc>
-      </w:tr>
-      <w:tr>
-        <w:tc>
-          <w:tcPr>
-            <w:tcW w:w="8299" w:type="dxa"/>
-            <w:tcBorders>
-              <w:top w:val="single" w:sz="4" w:space="0" w:color="auto"/>
-              <w:left w:val="single" w:sz="4" w:space="0" w:color="auto"/>
-              <w:bottom w:val="single" w:sz="4" w:space="0" w:color="auto"/>
-              <w:right w:val="single" w:sz="4" w:space="0" w:color="auto"/>
-            </w:tcBorders>
-          </w:tcPr>
-          <w:p>
-            <w:pPr>
-              <w:rPr>
-                <w:highlight w:val="yellow"/>
-              </w:rPr>
-            </w:pPr>
-            <w:r>
-              <w:rPr>
-                <w:highlight w:val="yellow"/>
-              </w:rPr>
-              <w:t>Acceptance test (exact description):</w:t>
-            </w:r>
-          </w:p>
-          <w:p>
-            <w:pPr>
-              <w:rPr>
-                <w:highlight w:val="yellow"/>
-              </w:rPr>
-            </w:pPr>
-          </w:p>
-        </w:tc>
-      </w:tr>
-    </w:tbl>
-    <w:p>
-      <w:pPr>
-        <w:rPr>
-          <w:b/>
-          <w:bCs/>
-          <w:highlight w:val="yellow"/>
-        </w:rPr>
-      </w:pPr>
-    </w:p>
-    <w:p>
-      <w:pPr>
-        <w:rPr>
-          <w:b/>
-          <w:bCs/>
-          <w:highlight w:val="yellow"/>
-        </w:rPr>
-      </w:pPr>
-      <w:r>
-        <w:rPr>
-          <w:b/>
-          <w:bCs/>
-          <w:highlight w:val="yellow"/>
-        </w:rPr>
-        <w:t>Bioinformatic toolbox</w:t>
-      </w:r>
-    </w:p>
-    <w:tbl>
-      <w:tblPr>
-        <w:tblStyle w:val="TableGrid"/>
-        <w:tblW w:w="0" w:type="auto"/>
-        <w:tblLook w:val="04A0" w:firstRow="1" w:lastRow="0" w:firstColumn="1" w:lastColumn="0" w:noHBand="0" w:noVBand="1"/>
-      </w:tblPr>
-      <w:tblGrid>
-        <w:gridCol w:w="8299"/>
-      </w:tblGrid>
-      <w:tr>
-        <w:tc>
-          <w:tcPr>
-            <w:tcW w:w="8299" w:type="dxa"/>
-            <w:tcBorders>
-              <w:top w:val="single" w:sz="4" w:space="0" w:color="auto"/>
-              <w:left w:val="single" w:sz="4" w:space="0" w:color="auto"/>
-              <w:bottom w:val="single" w:sz="4" w:space="0" w:color="auto"/>
-              <w:right w:val="single" w:sz="4" w:space="0" w:color="auto"/>
-            </w:tcBorders>
-            <w:hideMark/>
-          </w:tcPr>
-          <w:p>
-            <w:pPr>
-              <w:rPr>
-                <w:highlight w:val="yellow"/>
-              </w:rPr>
-            </w:pPr>
-            <w:r>
-              <w:rPr>
-                <w:highlight w:val="yellow"/>
-              </w:rPr>
-              <w:t>As a bioinformatician</w:t>
-            </w:r>
-          </w:p>
-        </w:tc>
-      </w:tr>
-      <w:tr>
-        <w:tc>
-          <w:tcPr>
-            <w:tcW w:w="8299" w:type="dxa"/>
-            <w:tcBorders>
-              <w:top w:val="single" w:sz="4" w:space="0" w:color="auto"/>
-              <w:left w:val="single" w:sz="4" w:space="0" w:color="auto"/>
-              <w:bottom w:val="single" w:sz="4" w:space="0" w:color="auto"/>
-              <w:right w:val="single" w:sz="4" w:space="0" w:color="auto"/>
-            </w:tcBorders>
-            <w:hideMark/>
-          </w:tcPr>
-          <w:p>
-            <w:pPr>
-              <w:rPr>
-                <w:highlight w:val="yellow"/>
-              </w:rPr>
-            </w:pPr>
-            <w:r>
-              <w:rPr>
-                <w:highlight w:val="yellow"/>
-              </w:rPr>
-              <w:t xml:space="preserve">I want to use a tool box. </w:t>
-            </w:r>
-          </w:p>
-        </w:tc>
-      </w:tr>
-      <w:tr>
-        <w:tc>
-          <w:tcPr>
-            <w:tcW w:w="8299" w:type="dxa"/>
-            <w:tcBorders>
-              <w:top w:val="single" w:sz="4" w:space="0" w:color="auto"/>
-              <w:left w:val="single" w:sz="4" w:space="0" w:color="auto"/>
-              <w:bottom w:val="single" w:sz="4" w:space="0" w:color="auto"/>
-              <w:right w:val="single" w:sz="4" w:space="0" w:color="auto"/>
-            </w:tcBorders>
-            <w:hideMark/>
-          </w:tcPr>
-          <w:p>
-            <w:pPr>
-              <w:rPr>
-                <w:highlight w:val="yellow"/>
-              </w:rPr>
-            </w:pPr>
-            <w:r>
-              <w:rPr>
-                <w:highlight w:val="yellow"/>
-              </w:rPr>
-              <w:t xml:space="preserve">So that I can perform simple task at any </w:t>
-            </w:r>
-            <w:proofErr w:type="spellStart"/>
-            <w:r>
-              <w:rPr>
-                <w:highlight w:val="yellow"/>
-              </w:rPr>
-              <w:t>pace,s</w:t>
-            </w:r>
-            <w:proofErr w:type="spellEnd"/>
-            <w:r>
-              <w:rPr>
-                <w:highlight w:val="yellow"/>
-              </w:rPr>
-              <w:t xml:space="preserve"> DNA-S protein, reverse complimentary, etc.</w:t>
-            </w:r>
-          </w:p>
-        </w:tc>
-      </w:tr>
-      <w:tr>
-        <w:tc>
-          <w:tcPr>
-            <w:tcW w:w="8299" w:type="dxa"/>
-            <w:tcBorders>
-              <w:top w:val="single" w:sz="4" w:space="0" w:color="auto"/>
-              <w:left w:val="single" w:sz="4" w:space="0" w:color="auto"/>
-              <w:bottom w:val="single" w:sz="4" w:space="0" w:color="auto"/>
-              <w:right w:val="single" w:sz="4" w:space="0" w:color="auto"/>
-            </w:tcBorders>
-            <w:hideMark/>
-          </w:tcPr>
-          <w:p>
-            <w:pPr>
-              <w:rPr>
-                <w:highlight w:val="yellow"/>
-              </w:rPr>
-            </w:pPr>
-            <w:r>
-              <w:rPr>
-                <w:highlight w:val="yellow"/>
-              </w:rPr>
-              <w:t>Acceptance criteria:</w:t>
-            </w:r>
-          </w:p>
-          <w:p>
-            <w:pPr>
-              <w:rPr>
-                <w:highlight w:val="yellow"/>
-              </w:rPr>
-            </w:pPr>
-            <w:r>
-              <w:rPr>
-                <w:highlight w:val="yellow"/>
-              </w:rPr>
-              <w:t xml:space="preserve">Take DNA sequences -&gt; protein sequences and similarity between a second DNA sequence.  </w:t>
-            </w:r>
-          </w:p>
-        </w:tc>
-      </w:tr>
-      <w:tr>
-        <w:tc>
-          <w:tcPr>
-            <w:tcW w:w="8299" w:type="dxa"/>
-            <w:tcBorders>
-              <w:top w:val="single" w:sz="4" w:space="0" w:color="auto"/>
-              <w:left w:val="single" w:sz="4" w:space="0" w:color="auto"/>
-              <w:bottom w:val="single" w:sz="4" w:space="0" w:color="auto"/>
-              <w:right w:val="single" w:sz="4" w:space="0" w:color="auto"/>
-            </w:tcBorders>
-          </w:tcPr>
-          <w:p>
-            <w:r>
-              <w:rPr>
-                <w:highlight w:val="yellow"/>
-              </w:rPr>
-              <w:t>Acceptance test (exact description):</w:t>
-            </w:r>
-          </w:p>
-          <w:p/>
-        </w:tc>
-      </w:tr>
-    </w:tbl>
-    <w:p/>
+    </w:p>
     <w:p/>
     <w:sectPr>
       <w:headerReference w:type="default" r:id="rId7"/>

</xml_diff>

<commit_message>
MV: clarified global user story
</commit_message>
<xml_diff>
--- a/BlastImplementation/documentation/Use case diagram/useCase_userStories/UserStories_21042026_final.docx
+++ b/BlastImplementation/documentation/Use case diagram/useCase_userStories/UserStories_21042026_final.docx
@@ -221,35 +221,15 @@
         </w:numPr>
       </w:pPr>
       <w:r>
-        <w:t xml:space="preserve">find and count the number of a specified pattern in a given DNA or protein sequence  </w:t>
+        <w:t>find all K-mers of a given length in a given DNA or protein sequence</w:t>
       </w:r>
     </w:p>
     <w:p>
       <w:pPr>
         <w:pStyle w:val="ListParagraph"/>
-        <w:numPr>
-          <w:ilvl w:val="0"/>
-          <w:numId w:val="13"/>
-        </w:numPr>
-      </w:pPr>
-      <w:r>
-        <w:t>find all K-</w:t>
-      </w:r>
-      <w:proofErr w:type="spellStart"/>
-      <w:r>
-        <w:t>mers</w:t>
-      </w:r>
-      <w:proofErr w:type="spellEnd"/>
-      <w:r>
-        <w:t xml:space="preserve"> of a given length in a given DNA or protein sequence</w:t>
-      </w:r>
+      </w:pPr>
     </w:p>
     <w:p>
-      <w:pPr>
-        <w:pStyle w:val="ListParagraph"/>
-      </w:pPr>
-    </w:p>
-    <w:p>
       <w:r>
         <w:t xml:space="preserve">For the BLASTP tool, </w:t>
       </w:r>
@@ -317,29 +297,13 @@
         <w:t>;</w:t>
       </w:r>
       <w:r>
-        <w:t xml:space="preserve"> the e-value threshold, the maximum number of output sequences (in case of many hits), and the scoring matrix that is used in the BLAST algorithm. The user wants to perform BLASTP using the default </w:t>
-      </w:r>
-      <w:proofErr w:type="spellStart"/>
-      <w:r>
-        <w:t>Uniprot</w:t>
-      </w:r>
-      <w:proofErr w:type="spellEnd"/>
-      <w:r>
-        <w:t xml:space="preserve"> database</w:t>
+        <w:t xml:space="preserve"> the e-value threshold, the maximum number of output sequences (in case of many hits), and the scoring matrix that is used in the BLAST algorithm. The user wants to perform BLASTP using the default Uniprot database</w:t>
       </w:r>
       <w:r>
         <w:t xml:space="preserve"> for proteins, or their own database when using BLASTN / BLASTP</w:t>
       </w:r>
       <w:r>
-        <w:t xml:space="preserve">. When the user provides its own database, the provided database needs to be used instead of the default </w:t>
-      </w:r>
-      <w:proofErr w:type="spellStart"/>
-      <w:r>
-        <w:t>Uniprot</w:t>
-      </w:r>
-      <w:proofErr w:type="spellEnd"/>
-      <w:r>
-        <w:t xml:space="preserve"> database</w:t>
+        <w:t>. When the user provides its own database, the provided database needs to be used instead of the default Uniprot database</w:t>
       </w:r>
       <w:r>
         <w:t xml:space="preserve"> in case of BLASTP</w:t>
@@ -360,15 +324,7 @@
         <w:t>stored in the downloads folder of the user and also be shown in a new output window. The output window needs to be the same</w:t>
       </w:r>
       <w:r>
-        <w:t xml:space="preserve">, whether the default </w:t>
-      </w:r>
-      <w:proofErr w:type="spellStart"/>
-      <w:r>
-        <w:t>Uniprot</w:t>
-      </w:r>
-      <w:proofErr w:type="spellEnd"/>
-      <w:r>
-        <w:t xml:space="preserve"> is used in BLASTP or the user gives their own database. </w:t>
+        <w:t xml:space="preserve">, whether the default Uniprot is used in BLASTP or the user gives their own database. </w:t>
       </w:r>
     </w:p>
     <w:p/>
@@ -870,13 +826,8 @@
             <w:r>
               <w:t xml:space="preserve">g the </w:t>
             </w:r>
-            <w:proofErr w:type="spellStart"/>
-            <w:r>
-              <w:t>gui</w:t>
-            </w:r>
-            <w:proofErr w:type="spellEnd"/>
-            <w:r>
-              <w:t xml:space="preserve"> shows after clicki</w:t>
+            <w:r>
+              <w:t>gui shows after clicki</w:t>
             </w:r>
             <w:r>
               <w:t>ng the but</w:t>
@@ -960,15 +911,7 @@
               <w:t>S</w:t>
             </w:r>
             <w:r>
-              <w:t xml:space="preserve">o that </w:t>
-            </w:r>
-            <w:proofErr w:type="spellStart"/>
-            <w:r>
-              <w:t>i</w:t>
-            </w:r>
-            <w:proofErr w:type="spellEnd"/>
-            <w:r>
-              <w:t xml:space="preserve"> know the search is running and the application has not frozen</w:t>
+              <w:t>o that i know the search is running and the application has not frozen</w:t>
             </w:r>
           </w:p>
         </w:tc>
@@ -1094,21 +1037,8 @@
             <w:r>
               <w:t xml:space="preserve">o that </w:t>
             </w:r>
-            <w:proofErr w:type="spellStart"/>
-            <w:r>
-              <w:t>i</w:t>
-            </w:r>
-            <w:proofErr w:type="spellEnd"/>
-            <w:r>
-              <w:t xml:space="preserve"> can save share and </w:t>
-            </w:r>
-            <w:proofErr w:type="spellStart"/>
-            <w:r>
-              <w:t>futher</w:t>
-            </w:r>
-            <w:proofErr w:type="spellEnd"/>
-            <w:r>
-              <w:t xml:space="preserve"> analyze my results outside of the application</w:t>
+            <w:r>
+              <w:t>i can save share and futher analyze my results outside of the application</w:t>
             </w:r>
           </w:p>
         </w:tc>
@@ -1224,15 +1154,7 @@
               <w:t>S</w:t>
             </w:r>
             <w:r>
-              <w:t xml:space="preserve">o that </w:t>
-            </w:r>
-            <w:proofErr w:type="spellStart"/>
-            <w:r>
-              <w:t>i</w:t>
-            </w:r>
-            <w:proofErr w:type="spellEnd"/>
-            <w:r>
-              <w:t xml:space="preserve"> </w:t>
+              <w:t xml:space="preserve">o that i </w:t>
             </w:r>
             <w:r>
               <w:t>can be guided toward the most appropriate next analysis step depending on my sequence type and properties</w:t>
@@ -1498,19 +1420,11 @@
               </w:rPr>
               <w:t xml:space="preserve">Having two </w:t>
             </w:r>
-            <w:proofErr w:type="spellStart"/>
             <w:r>
               <w:rPr>
                 <w:highlight w:val="green"/>
               </w:rPr>
-              <w:t>tsv</w:t>
-            </w:r>
-            <w:proofErr w:type="spellEnd"/>
-            <w:r>
-              <w:rPr>
-                <w:highlight w:val="green"/>
-              </w:rPr>
-              <w:t xml:space="preserve"> </w:t>
+              <w:t xml:space="preserve">tsv </w:t>
             </w:r>
             <w:r>
               <w:rPr>
@@ -2606,21 +2520,7 @@
         <w:rPr>
           <w:highlight w:val="lightGray"/>
         </w:rPr>
-        <w:t xml:space="preserve">BLASTP on default </w:t>
-      </w:r>
-      <w:proofErr w:type="spellStart"/>
-      <w:r>
-        <w:rPr>
-          <w:highlight w:val="lightGray"/>
-        </w:rPr>
-        <w:t>Uniprot</w:t>
-      </w:r>
-      <w:proofErr w:type="spellEnd"/>
-      <w:r>
-        <w:rPr>
-          <w:highlight w:val="lightGray"/>
-        </w:rPr>
-        <w:t xml:space="preserve"> database</w:t>
+        <w:t>BLASTP on default Uniprot database</w:t>
       </w:r>
     </w:p>
     <w:tbl>
@@ -2687,21 +2587,7 @@
               <w:rPr>
                 <w:highlight w:val="lightGray"/>
               </w:rPr>
-              <w:t xml:space="preserve">using the default </w:t>
-            </w:r>
-            <w:proofErr w:type="spellStart"/>
-            <w:r>
-              <w:rPr>
-                <w:highlight w:val="lightGray"/>
-              </w:rPr>
-              <w:t>Uniprot</w:t>
-            </w:r>
-            <w:proofErr w:type="spellEnd"/>
-            <w:r>
-              <w:rPr>
-                <w:highlight w:val="lightGray"/>
-              </w:rPr>
-              <w:t xml:space="preserve"> database after I entered either a protein sequence in FASTA format in the therefore intended text box or uploaded a FASTA file of a protein sequence. After entering the sequence</w:t>
+              <w:t>using the default Uniprot database after I entered either a protein sequence in FASTA format in the therefore intended text box or uploaded a FASTA file of a protein sequence. After entering the sequence</w:t>
             </w:r>
             <w:r>
               <w:rPr>
@@ -2886,105 +2772,77 @@
               <w:rPr>
                 <w:highlight w:val="lightGray"/>
               </w:rPr>
-              <w:t xml:space="preserve">run the BLASTP tool using my own custom database provided in FASTA format. As with the default </w:t>
-            </w:r>
-            <w:proofErr w:type="spellStart"/>
-            <w:r>
+              <w:t xml:space="preserve">run the BLASTP tool using my own custom database provided in FASTA format. As with the default Uniprot database, the query protein sequence can be provided in text box in FASTA format or uploaded as a FASTA file. When I press the BLAST button, the BLASTP should run using my custom database.  </w:t>
+            </w:r>
+          </w:p>
+        </w:tc>
+      </w:tr>
+      <w:tr>
+        <w:tc>
+          <w:tcPr>
+            <w:tcW w:w="8299" w:type="dxa"/>
+          </w:tcPr>
+          <w:p>
+            <w:pPr>
               <w:rPr>
                 <w:highlight w:val="lightGray"/>
               </w:rPr>
-              <w:t>Uniprot</w:t>
-            </w:r>
-            <w:proofErr w:type="spellEnd"/>
-            <w:r>
-              <w:rPr>
+            </w:pPr>
+            <w:r>
+              <w:rPr>
+                <w:b/>
+                <w:bCs/>
                 <w:highlight w:val="lightGray"/>
               </w:rPr>
-              <w:t xml:space="preserve"> database, the query protein sequence can be provided in text box in FASTA format or uploaded as a FASTA file. When I press the BLAST button, the BLASTP should run using my custom database.  </w:t>
-            </w:r>
-          </w:p>
-        </w:tc>
-      </w:tr>
-      <w:tr>
-        <w:tc>
-          <w:tcPr>
-            <w:tcW w:w="8299" w:type="dxa"/>
-          </w:tcPr>
-          <w:p>
-            <w:pPr>
+              <w:t>So that</w:t>
+            </w:r>
+            <w:r>
               <w:rPr>
                 <w:highlight w:val="lightGray"/>
               </w:rPr>
-            </w:pPr>
-            <w:r>
-              <w:rPr>
-                <w:b/>
-                <w:bCs/>
+              <w:t xml:space="preserve"> </w:t>
+            </w:r>
+            <w:r>
+              <w:rPr>
                 <w:highlight w:val="lightGray"/>
               </w:rPr>
-              <w:t>So that</w:t>
-            </w:r>
-            <w:r>
+              <w:t>I can analyze, using the BLASTP output, which proteins are similar to my query sequence and from what organism these proteins are.</w:t>
+            </w:r>
+          </w:p>
+        </w:tc>
+      </w:tr>
+      <w:tr>
+        <w:tc>
+          <w:tcPr>
+            <w:tcW w:w="8299" w:type="dxa"/>
+          </w:tcPr>
+          <w:p>
+            <w:pPr>
               <w:rPr>
                 <w:highlight w:val="lightGray"/>
               </w:rPr>
-              <w:t xml:space="preserve"> </w:t>
-            </w:r>
-            <w:r>
-              <w:rPr>
+            </w:pPr>
+            <w:r>
+              <w:rPr>
+                <w:b/>
+                <w:bCs/>
                 <w:highlight w:val="lightGray"/>
               </w:rPr>
-              <w:t>I can analyze, using the BLASTP output, which proteins are similar to my query sequence and from what organism these proteins are.</w:t>
-            </w:r>
-          </w:p>
-        </w:tc>
-      </w:tr>
-      <w:tr>
-        <w:tc>
-          <w:tcPr>
-            <w:tcW w:w="8299" w:type="dxa"/>
-          </w:tcPr>
-          <w:p>
-            <w:pPr>
+              <w:t>Acceptance criteria</w:t>
+            </w:r>
+            <w:r>
               <w:rPr>
                 <w:highlight w:val="lightGray"/>
               </w:rPr>
-            </w:pPr>
-            <w:r>
-              <w:rPr>
-                <w:b/>
-                <w:bCs/>
+              <w:t>:</w:t>
+            </w:r>
+          </w:p>
+          <w:p>
+            <w:r>
+              <w:rPr>
                 <w:highlight w:val="lightGray"/>
               </w:rPr>
-              <w:t>Acceptance criteria</w:t>
-            </w:r>
-            <w:r>
-              <w:rPr>
-                <w:highlight w:val="lightGray"/>
-              </w:rPr>
-              <w:t>:</w:t>
-            </w:r>
-          </w:p>
-          <w:p>
-            <w:r>
-              <w:rPr>
-                <w:highlight w:val="lightGray"/>
-              </w:rPr>
-              <w:t xml:space="preserve">After I put in either a protein sequence in FASTA format in the therefore intended text box or upload a FASTA file of a protein sequence and provide a custom database in FASTA format, the BLASTP output should be written to a file in my downloads folder and shown in a new window when I press the BLAST button. Importantly, it should not use the default </w:t>
-            </w:r>
-            <w:proofErr w:type="spellStart"/>
-            <w:r>
-              <w:rPr>
-                <w:highlight w:val="lightGray"/>
-              </w:rPr>
-              <w:t>Uniprot</w:t>
-            </w:r>
-            <w:proofErr w:type="spellEnd"/>
-            <w:r>
-              <w:rPr>
-                <w:highlight w:val="lightGray"/>
-              </w:rPr>
-              <w:t xml:space="preserve"> database when I provide my own database.</w:t>
+              <w:t>After I put in either a protein sequence in FASTA format in the therefore intended text box or upload a FASTA file of a protein sequence and provide a custom database in FASTA format, the BLASTP output should be written to a file in my downloads folder and shown in a new window when I press the BLAST button. Importantly, it should not use the default Uniprot database when I provide my own database.</w:t>
             </w:r>
           </w:p>
         </w:tc>
@@ -3072,17 +2930,8 @@
           <w:b/>
           <w:bCs/>
         </w:rPr>
-        <w:t xml:space="preserve">Group A: </w:t>
-      </w:r>
-      <w:proofErr w:type="spellStart"/>
-      <w:r>
-        <w:rPr>
-          <w:b/>
-          <w:bCs/>
-        </w:rPr>
-        <w:t>EzBLAST</w:t>
-      </w:r>
-      <w:proofErr w:type="spellEnd"/>
+        <w:t>Group A: EzBLAST</w:t>
+      </w:r>
     </w:p>
     <w:p>
       <w:pPr>
@@ -3113,15 +2962,7 @@
     </w:p>
     <w:p>
       <w:r>
-        <w:t xml:space="preserve">The user is a life science scientist and wants to analyze their data. In this instance, we limit the input data to a </w:t>
-      </w:r>
-      <w:proofErr w:type="spellStart"/>
-      <w:r>
-        <w:t>fasta</w:t>
-      </w:r>
-      <w:proofErr w:type="spellEnd"/>
-      <w:r>
-        <w:t xml:space="preserve"> sequence of an unknown organism. </w:t>
+        <w:t xml:space="preserve">The user is a life science scientist and wants to analyze their data. In this instance, we limit the input data to a fasta sequence of an unknown organism. </w:t>
       </w:r>
     </w:p>
     <w:p/>
@@ -4167,25 +4008,7 @@
           <w:bCs/>
           <w:highlight w:val="yellow"/>
         </w:rPr>
-        <w:t xml:space="preserve">Upload </w:t>
-      </w:r>
-      <w:proofErr w:type="spellStart"/>
-      <w:r>
-        <w:rPr>
-          <w:b/>
-          <w:bCs/>
-          <w:highlight w:val="yellow"/>
-        </w:rPr>
-        <w:t>fasta</w:t>
-      </w:r>
-      <w:proofErr w:type="spellEnd"/>
-      <w:r>
-        <w:rPr>
-          <w:b/>
-          <w:bCs/>
-          <w:highlight w:val="yellow"/>
-        </w:rPr>
-        <w:t xml:space="preserve"> file</w:t>
+        <w:t>Upload fasta file</w:t>
       </w:r>
     </w:p>
     <w:tbl>
@@ -4285,21 +4108,7 @@
               <w:rPr>
                 <w:highlight w:val="yellow"/>
               </w:rPr>
-              <w:t xml:space="preserve">So that the sequence file can be inserted into the BLAST command. Name of the file is displayed after uploading. If not accepted display the message ‘ file is not a </w:t>
-            </w:r>
-            <w:proofErr w:type="spellStart"/>
-            <w:r>
-              <w:rPr>
-                <w:highlight w:val="yellow"/>
-              </w:rPr>
-              <w:t>fasta</w:t>
-            </w:r>
-            <w:proofErr w:type="spellEnd"/>
-            <w:r>
-              <w:rPr>
-                <w:highlight w:val="yellow"/>
-              </w:rPr>
-              <w:t xml:space="preserve"> file’</w:t>
+              <w:t>So that the sequence file can be inserted into the BLAST command. Name of the file is displayed after uploading. If not accepted display the message ‘ file is not a fasta file’</w:t>
             </w:r>
           </w:p>
         </w:tc>
@@ -4339,35 +4148,7 @@
               <w:rPr>
                 <w:highlight w:val="yellow"/>
               </w:rPr>
-              <w:t xml:space="preserve">Has to be a </w:t>
-            </w:r>
-            <w:proofErr w:type="spellStart"/>
-            <w:r>
-              <w:rPr>
-                <w:highlight w:val="yellow"/>
-              </w:rPr>
-              <w:t>fasta</w:t>
-            </w:r>
-            <w:proofErr w:type="spellEnd"/>
-            <w:r>
-              <w:rPr>
-                <w:highlight w:val="yellow"/>
-              </w:rPr>
-              <w:t xml:space="preserve"> file. A </w:t>
-            </w:r>
-            <w:proofErr w:type="spellStart"/>
-            <w:r>
-              <w:rPr>
-                <w:highlight w:val="yellow"/>
-              </w:rPr>
-              <w:t>fasta</w:t>
-            </w:r>
-            <w:proofErr w:type="spellEnd"/>
-            <w:r>
-              <w:rPr>
-                <w:highlight w:val="yellow"/>
-              </w:rPr>
-              <w:t xml:space="preserve"> at the end of the file name. Sequence begins with  &gt;  </w:t>
+              <w:t xml:space="preserve">Has to be a fasta file. A fasta at the end of the file name. Sequence begins with  &gt;  </w:t>
             </w:r>
           </w:p>
         </w:tc>

</xml_diff>